<commit_message>
docs+test: feature-ledger/README/CONTINUATION refresh + WebAuthn spec + extensions_auth network-robustness
- extensions_auth.sh: bound the Open VSX install + SKIP-with-reason (network_unreachable_external)
  when Open VSX is throttled/unreachable, instead of hanging/FAILing (§11.4.3). Capability proven
  earlier (5/5 + 8-ext probe); a throttled marketplace at run-time is external, not a defect.
- docs/features/Status(+Summary): §11.4.153 ledger reconciled to real evidence/commits.
- README: added the missing §11.4.57 Tracked-Items doc-link section.
- CONTINUATION: §12.10 brought current (7 post-release commits; next=dev-0.0.4).
- docs/superpowers/specs/2026-07-01-webauthn-passkey-login.md: §11.4.150 design SPEC (go-webauthn,
  BSD-3-Clause; ssh-key stays recovery) for operator review — NOT implemented.

Co-Authored-By: Claude Opus 4.8 <noreply@anthropic.com>
</commit_message>
<xml_diff>
--- a/docs/features/Status.docx
+++ b/docs/features/Status.docx
@@ -26,7 +26,7 @@
         <w:t xml:space="preserve"> </w:t>
       </w:r>
       <w:r>
-        <w:t xml:space="preserve">2 ·</w:t>
+        <w:t xml:space="preserve">3 ·</w:t>
       </w:r>
       <w:r>
         <w:t xml:space="preserve"> </w:t>
@@ -42,7 +42,7 @@
         <w:t xml:space="preserve"> </w:t>
       </w:r>
       <w:r>
-        <w:t xml:space="preserve">2026-07-01T19:45:00Z</w:t>
+        <w:t xml:space="preserve">2026-07-01T20:30:00Z</w:t>
       </w:r>
     </w:p>
     <w:p>
@@ -84,7 +84,80 @@
         <w:t xml:space="preserve">codeserver-1.0.0-dev-0.0.3</w:t>
       </w:r>
       <w:r>
-        <w:t xml:space="preserve">. Every user-facing capability is enumerated</w:t>
+        <w:t xml:space="preserve">, extended with the post-</w:t>
+      </w:r>
+      <w:r>
+        <w:rPr>
+          <w:rStyle w:val="VerbatimChar"/>
+        </w:rPr>
+        <w:t xml:space="preserve">0.0.3</w:t>
+      </w:r>
+      <w:r>
+        <w:t xml:space="preserve"> </w:t>
+      </w:r>
+      <w:r>
+        <w:t xml:space="preserve">feature additions</w:t>
+      </w:r>
+      <w:r>
+        <w:t xml:space="preserve"> </w:t>
+      </w:r>
+      <w:r>
+        <w:t xml:space="preserve">landed by commits</w:t>
+      </w:r>
+      <w:r>
+        <w:t xml:space="preserve"> </w:t>
+      </w:r>
+      <w:r>
+        <w:rPr>
+          <w:rStyle w:val="VerbatimChar"/>
+        </w:rPr>
+        <w:t xml:space="preserve">8351e4c</w:t>
+      </w:r>
+      <w:r>
+        <w:t xml:space="preserve"> </w:t>
+      </w:r>
+      <w:r>
+        <w:t xml:space="preserve">(login-form clipboard buttons + UI-driven marketplace</w:t>
+      </w:r>
+      <w:r>
+        <w:t xml:space="preserve"> </w:t>
+      </w:r>
+      <w:r>
+        <w:t xml:space="preserve">journey) and</w:t>
+      </w:r>
+      <w:r>
+        <w:t xml:space="preserve"> </w:t>
+      </w:r>
+      <w:r>
+        <w:rPr>
+          <w:rStyle w:val="VerbatimChar"/>
+        </w:rPr>
+        <w:t xml:space="preserve">97a8c69</w:t>
+      </w:r>
+      <w:r>
+        <w:t xml:space="preserve"> </w:t>
+      </w:r>
+      <w:r>
+        <w:t xml:space="preserve">(VS Code Dark default theme + popular-extensions matrix), plus</w:t>
+      </w:r>
+      <w:r>
+        <w:t xml:space="preserve"> </w:t>
+      </w:r>
+      <w:r>
+        <w:t xml:space="preserve">the now-</w:t>
+      </w:r>
+      <w:r>
+        <w:rPr>
+          <w:b/>
+          <w:bCs/>
+        </w:rPr>
+        <w:t xml:space="preserve">LIVE</w:t>
+      </w:r>
+      <w:r>
+        <w:t xml:space="preserve"> </w:t>
+      </w:r>
+      <w:r>
+        <w:t xml:space="preserve">rootless-Quadlet edge. Every user-facing capability is enumerated</w:t>
       </w:r>
       <w:r>
         <w:t xml:space="preserve"> </w:t>
@@ -2085,40 +2158,157 @@
               <w:t xml:space="preserve">WantedBy=default.target</w:t>
             </w:r>
             <w:r>
-              <w:t xml:space="preserve">, linger)</w:t>
-            </w:r>
-          </w:p>
-        </w:tc>
-        <w:tc>
-          <w:tcPr/>
-          <w:p>
-            <w:pPr>
-              <w:pStyle w:val="Compact"/>
-            </w:pPr>
-            <w:r>
-              <w:t xml:space="preserve">installer + Quadlet landed</w:t>
-            </w:r>
-          </w:p>
-        </w:tc>
-        <w:tc>
-          <w:tcPr/>
-          <w:p>
-            <w:pPr>
-              <w:pStyle w:val="Compact"/>
-            </w:pPr>
-            <w:r>
-              <w:t xml:space="preserve">(install/arm)</w:t>
-            </w:r>
-          </w:p>
-        </w:tc>
-        <w:tc>
-          <w:tcPr/>
-          <w:p>
-            <w:pPr>
-              <w:pStyle w:val="Compact"/>
-            </w:pPr>
-            <w:r>
-              <w:t xml:space="preserve">PENDING · files landed; arm/enable + full power-cycle survival not yet captured</w:t>
+              <w:t xml:space="preserve">,</w:t>
+            </w:r>
+            <w:r>
+              <w:t xml:space="preserve"> </w:t>
+            </w:r>
+            <w:r>
+              <w:rPr>
+                <w:rStyle w:val="VerbatimChar"/>
+              </w:rPr>
+              <w:t xml:space="preserve">Linger=yes</w:t>
+            </w:r>
+            <w:r>
+              <w:t xml:space="preserve">)</w:t>
+            </w:r>
+          </w:p>
+        </w:tc>
+        <w:tc>
+          <w:tcPr/>
+          <w:p>
+            <w:pPr>
+              <w:pStyle w:val="Compact"/>
+            </w:pPr>
+            <w:r>
+              <w:t xml:space="preserve">yes — LIVE:</w:t>
+            </w:r>
+            <w:r>
+              <w:t xml:space="preserve"> </w:t>
+            </w:r>
+            <w:r>
+              <w:rPr>
+                <w:rStyle w:val="VerbatimChar"/>
+              </w:rPr>
+              <w:t xml:space="preserve">helixcode-caddy.service</w:t>
+            </w:r>
+            <w:r>
+              <w:t xml:space="preserve"> </w:t>
+            </w:r>
+            <w:r>
+              <w:rPr>
+                <w:rStyle w:val="VerbatimChar"/>
+              </w:rPr>
+              <w:t xml:space="preserve">ActiveState=active</w:t>
+            </w:r>
+            <w:r>
+              <w:t xml:space="preserve">/</w:t>
+            </w:r>
+            <w:r>
+              <w:rPr>
+                <w:rStyle w:val="VerbatimChar"/>
+              </w:rPr>
+              <w:t xml:space="preserve">SubState=running</w:t>
+            </w:r>
+            <w:r>
+              <w:t xml:space="preserve">,</w:t>
+            </w:r>
+            <w:r>
+              <w:t xml:space="preserve"> </w:t>
+            </w:r>
+            <w:r>
+              <w:rPr>
+                <w:rStyle w:val="VerbatimChar"/>
+              </w:rPr>
+              <w:t xml:space="preserve">UnitFileState=generated</w:t>
+            </w:r>
+            <w:r>
+              <w:t xml:space="preserve">, survives session crashes; edge answers HTTPS</w:t>
+            </w:r>
+            <w:r>
+              <w:t xml:space="preserve"> </w:t>
+            </w:r>
+            <w:r>
+              <w:rPr>
+                <w:rStyle w:val="VerbatimChar"/>
+              </w:rPr>
+              <w:t xml:space="preserve">:52443</w:t>
+            </w:r>
+            <w:r>
+              <w:t xml:space="preserve"> </w:t>
+            </w:r>
+            <w:r>
+              <w:t xml:space="preserve">(401 at the live gate)</w:t>
+            </w:r>
+          </w:p>
+        </w:tc>
+        <w:tc>
+          <w:tcPr/>
+          <w:p>
+            <w:pPr>
+              <w:pStyle w:val="Compact"/>
+            </w:pPr>
+            <w:r>
+              <w:t xml:space="preserve">(systemctl --user status + linger + Quadlet generator)</w:t>
+            </w:r>
+          </w:p>
+        </w:tc>
+        <w:tc>
+          <w:tcPr/>
+          <w:p>
+            <w:pPr>
+              <w:pStyle w:val="Compact"/>
+            </w:pPr>
+            <w:r>
+              <w:t xml:space="preserve">PASS · live unit</w:t>
+            </w:r>
+            <w:r>
+              <w:t xml:space="preserve"> </w:t>
+            </w:r>
+            <w:r>
+              <w:rPr>
+                <w:rStyle w:val="VerbatimChar"/>
+              </w:rPr>
+              <w:t xml:space="preserve">active (running)</w:t>
+            </w:r>
+            <w:r>
+              <w:t xml:space="preserve"> </w:t>
+            </w:r>
+            <w:r>
+              <w:t xml:space="preserve">from Quadlet</w:t>
+            </w:r>
+            <w:r>
+              <w:t xml:space="preserve"> </w:t>
+            </w:r>
+            <w:r>
+              <w:rPr>
+                <w:rStyle w:val="VerbatimChar"/>
+              </w:rPr>
+              <w:t xml:space="preserve">~/.config/containers/systemd/helixcode-caddy.container</w:t>
+            </w:r>
+            <w:r>
+              <w:t xml:space="preserve">,</w:t>
+            </w:r>
+            <w:r>
+              <w:t xml:space="preserve"> </w:t>
+            </w:r>
+            <w:r>
+              <w:rPr>
+                <w:rStyle w:val="VerbatimChar"/>
+              </w:rPr>
+              <w:t xml:space="preserve">Linger=yes</w:t>
+            </w:r>
+            <w:r>
+              <w:t xml:space="preserve">, edge live on</w:t>
+            </w:r>
+            <w:r>
+              <w:t xml:space="preserve"> </w:t>
+            </w:r>
+            <w:r>
+              <w:rPr>
+                <w:rStyle w:val="VerbatimChar"/>
+              </w:rPr>
+              <w:t xml:space="preserve">:52443</w:t>
             </w:r>
           </w:p>
         </w:tc>
@@ -3113,7 +3303,7 @@
               <w:pStyle w:val="Compact"/>
             </w:pPr>
             <w:r>
-              <w:t xml:space="preserve">Login-form copy/paste clipboard buttons (accessible, graceful in insecure context)</w:t>
+              <w:t xml:space="preserve">Login-form copy/paste clipboard buttons (accessible copy sign-cmd + challenge, paste recognises armored SSH signature, multi-sig picker, XSS-safe, progressive-enhancement)</w:t>
             </w:r>
           </w:p>
         </w:tc>
@@ -3140,53 +3330,1304 @@
               </w:rPr>
               <w:t xml:space="preserve">services/auth_gate/assets/login_enhance.js</w:t>
             </w:r>
-          </w:p>
-        </w:tc>
-        <w:tc>
-          <w:tcPr/>
-          <w:p>
-            <w:pPr>
-              <w:pStyle w:val="Compact"/>
-            </w:pPr>
-            <w:r>
-              <w:t xml:space="preserve">login page</w:t>
-            </w:r>
-          </w:p>
-        </w:tc>
-        <w:tc>
-          <w:tcPr/>
-          <w:p>
-            <w:pPr>
-              <w:pStyle w:val="Compact"/>
-            </w:pPr>
+            <w:r>
+              <w:t xml:space="preserve">,</w:t>
+            </w:r>
+            <w:r>
+              <w:t xml:space="preserve"> </w:t>
+            </w:r>
+            <w:r>
+              <w:rPr>
+                <w:rStyle w:val="VerbatimChar"/>
+              </w:rPr>
+              <w:t xml:space="preserve">services/auth_gate/server.go</w:t>
+            </w:r>
+            <w:r>
+              <w:t xml:space="preserve"> </w:t>
+            </w:r>
+            <w:r>
+              <w:t xml:space="preserve">(commit</w:t>
+            </w:r>
+            <w:r>
+              <w:t xml:space="preserve"> </w:t>
+            </w:r>
+            <w:r>
+              <w:rPr>
+                <w:rStyle w:val="VerbatimChar"/>
+              </w:rPr>
+              <w:t xml:space="preserve">8351e4c</w:t>
+            </w:r>
+            <w:r>
+              <w:t xml:space="preserve">)</w:t>
+            </w:r>
+          </w:p>
+        </w:tc>
+        <w:tc>
+          <w:tcPr/>
+          <w:p>
+            <w:pPr>
+              <w:pStyle w:val="Compact"/>
+            </w:pPr>
+            <w:r>
+              <w:t xml:space="preserve">rendered live on the edge login page</w:t>
+            </w:r>
+          </w:p>
+        </w:tc>
+        <w:tc>
+          <w:tcPr/>
+          <w:p>
+            <w:pPr>
+              <w:pStyle w:val="Compact"/>
+            </w:pPr>
+            <w:r>
+              <w:t xml:space="preserve">yes — LIVE 3/3 (served page + node unit + host-rendered CDP pixel proof)</w:t>
+            </w:r>
+          </w:p>
+        </w:tc>
+        <w:tc>
+          <w:tcPr/>
+          <w:p>
+            <w:pPr>
+              <w:pStyle w:val="Compact"/>
+            </w:pPr>
+            <w:r>
+              <w:rPr>
+                <w:rStyle w:val="VerbatimChar"/>
+              </w:rPr>
+              <w:t xml:space="preserve">login_ui_auth.sh</w:t>
+            </w:r>
+            <w:r>
+              <w:t xml:space="preserve"> </w:t>
+            </w:r>
+            <w:r>
+              <w:t xml:space="preserve">(L1 served-page + L2 node unit 8/8 + L3 §11.4.170 CDP),</w:t>
+            </w:r>
+            <w:r>
+              <w:t xml:space="preserve"> </w:t>
+            </w:r>
+            <w:r>
+              <w:rPr>
+                <w:rStyle w:val="VerbatimChar"/>
+              </w:rPr>
+              <w:t xml:space="preserve">server_login_ui_test.go</w:t>
+            </w:r>
+          </w:p>
+        </w:tc>
+        <w:tc>
+          <w:tcPr/>
+          <w:p>
+            <w:pPr>
+              <w:pStyle w:val="Compact"/>
+            </w:pPr>
+            <w:r>
+              <w:t xml:space="preserve">PASS · L2 node 8/8</w:t>
+            </w:r>
+            <w:r>
+              <w:t xml:space="preserve"> </w:t>
+            </w:r>
+            <w:r>
+              <w:rPr>
+                <w:rStyle w:val="VerbatimChar"/>
+              </w:rPr>
+              <w:t xml:space="preserve">qa-results/tests/login_ui_auth/20260701T184629Z-1069432/l2_node_unit.txt</w:t>
+            </w:r>
+            <w:r>
+              <w:t xml:space="preserve"> </w:t>
+            </w:r>
+            <w:r>
+              <w:t xml:space="preserve">+ L3 CDP pixel proof</w:t>
+            </w:r>
+            <w:r>
+              <w:t xml:space="preserve"> </w:t>
+            </w:r>
+            <w:r>
+              <w:rPr>
+                <w:rStyle w:val="VerbatimChar"/>
+              </w:rPr>
+              <w:t xml:space="preserve">ok:true</w:t>
+            </w:r>
+            <w:r>
+              <w:t xml:space="preserve"> </w:t>
+            </w:r>
+            <w:r>
+              <w:t xml:space="preserve">(buttons render/labelled/non-overlapping, copy→clipboard, paste→fill, 2-sig→picker, XSS-safe, no-auto-submit)</w:t>
+            </w:r>
+            <w:r>
+              <w:t xml:space="preserve"> </w:t>
+            </w:r>
+            <w:r>
+              <w:rPr>
+                <w:rStyle w:val="VerbatimChar"/>
+              </w:rPr>
+              <w:t xml:space="preserve">qa-results/tests/login_ui_auth/20260701T172810Z-584930/l3_visual.txt</w:t>
+            </w:r>
+            <w:r>
+              <w:t xml:space="preserve"> </w:t>
+            </w:r>
+            <w:r>
+              <w:t xml:space="preserve">(</w:t>
+            </w:r>
+            <w:r>
+              <w:rPr>
+                <w:rStyle w:val="VerbatimChar"/>
+              </w:rPr>
+              <w:t xml:space="preserve">login_rendered.png</w:t>
+            </w:r>
+            <w:r>
+              <w:t xml:space="preserve">)</w:t>
+            </w:r>
+          </w:p>
+        </w:tc>
+        <w:tc>
+          <w:tcPr/>
+          <w:p>
+            <w:pPr>
+              <w:pStyle w:val="Compact"/>
+            </w:pPr>
+            <w:r>
+              <w:t xml:space="preserve">PENDING</w:t>
+            </w:r>
+          </w:p>
+        </w:tc>
+      </w:tr>
+      <w:tr>
+        <w:tc>
+          <w:tcPr/>
+          <w:p>
+            <w:pPr>
+              <w:pStyle w:val="Compact"/>
+            </w:pPr>
+            <w:r>
+              <w:t xml:space="preserve">code-server</w:t>
+            </w:r>
+          </w:p>
+        </w:tc>
+        <w:tc>
+          <w:tcPr/>
+          <w:p>
+            <w:pPr>
+              <w:pStyle w:val="Compact"/>
+            </w:pPr>
+            <w:r>
+              <w:t xml:space="preserve">Host-native editor served (authed 200,</w:t>
+            </w:r>
+            <w:r>
+              <w:t xml:space="preserve"> </w:t>
+            </w:r>
+            <w:r>
+              <w:rPr>
+                <w:rStyle w:val="VerbatimChar"/>
+              </w:rPr>
+              <w:t xml:space="preserve">X-Helix-User: milosvasic</w:t>
+            </w:r>
+            <w:r>
+              <w:t xml:space="preserve">)</w:t>
+            </w:r>
+          </w:p>
+        </w:tc>
+        <w:tc>
+          <w:tcPr/>
+          <w:p>
+            <w:pPr>
+              <w:pStyle w:val="Compact"/>
+            </w:pPr>
+            <w:r>
+              <w:t xml:space="preserve">editor</w:t>
+            </w:r>
+          </w:p>
+        </w:tc>
+        <w:tc>
+          <w:tcPr/>
+          <w:p>
+            <w:pPr>
+              <w:pStyle w:val="Compact"/>
+            </w:pPr>
+            <w:r>
+              <w:rPr>
+                <w:rStyle w:val="VerbatimChar"/>
+              </w:rPr>
+              <w:t xml:space="preserve">deploy/systemd/helix-code-server.service</w:t>
+            </w:r>
+          </w:p>
+        </w:tc>
+        <w:tc>
+          <w:tcPr/>
+          <w:p>
+            <w:pPr>
+              <w:pStyle w:val="Compact"/>
+            </w:pPr>
+            <w:r>
+              <w:rPr>
+                <w:rStyle w:val="VerbatimChar"/>
+              </w:rPr>
+              <w:t xml:space="preserve">systemd --user</w:t>
+            </w:r>
+            <w:r>
+              <w:t xml:space="preserve"> </w:t>
+            </w:r>
+            <w:r>
+              <w:t xml:space="preserve">as</w:t>
+            </w:r>
+            <w:r>
+              <w:t xml:space="preserve"> </w:t>
+            </w:r>
+            <w:r>
+              <w:rPr>
+                <w:rStyle w:val="VerbatimChar"/>
+              </w:rPr>
+              <w:t xml:space="preserve">milosvasic</w:t>
+            </w:r>
+            <w:r>
+              <w:t xml:space="preserve">, Caddy reverse_proxy</w:t>
+            </w:r>
+          </w:p>
+        </w:tc>
+        <w:tc>
+          <w:tcPr/>
+          <w:p>
+            <w:pPr>
+              <w:pStyle w:val="Compact"/>
+            </w:pPr>
+            <w:r>
+              <w:t xml:space="preserve">yes</w:t>
+            </w:r>
+          </w:p>
+        </w:tc>
+        <w:tc>
+          <w:tcPr/>
+          <w:p>
+            <w:pPr>
+              <w:pStyle w:val="Compact"/>
+            </w:pPr>
+            <w:r>
+              <w:t xml:space="preserve">e2e_auth (D), challenges_auth (CH1), helixqa_auth (QA-004)</w:t>
+            </w:r>
+          </w:p>
+        </w:tc>
+        <w:tc>
+          <w:tcPr/>
+          <w:p>
+            <w:pPr>
+              <w:pStyle w:val="Compact"/>
+            </w:pPr>
+            <w:r>
+              <w:t xml:space="preserve">PASS · editor loads (9 markers)</w:t>
+            </w:r>
+            <w:r>
+              <w:t xml:space="preserve"> </w:t>
+            </w:r>
+            <w:r>
+              <w:rPr>
+                <w:rStyle w:val="VerbatimChar"/>
+              </w:rPr>
+              <w:t xml:space="preserve">qa-results/tests/challenges_auth/20260701T151325Z-3188693/ch1_sshkey_login.txt</w:t>
+            </w:r>
+          </w:p>
+        </w:tc>
+        <w:tc>
+          <w:tcPr/>
+          <w:p>
+            <w:pPr>
+              <w:pStyle w:val="Compact"/>
+            </w:pPr>
+            <w:r>
+              <w:t xml:space="preserve">PENDING</w:t>
+            </w:r>
+          </w:p>
+        </w:tc>
+      </w:tr>
+      <w:tr>
+        <w:tc>
+          <w:tcPr/>
+          <w:p>
+            <w:pPr>
+              <w:pStyle w:val="Compact"/>
+            </w:pPr>
+            <w:r>
+              <w:t xml:space="preserve">code-server</w:t>
+            </w:r>
+          </w:p>
+        </w:tc>
+        <w:tc>
+          <w:tcPr/>
+          <w:p>
+            <w:pPr>
+              <w:pStyle w:val="Compact"/>
+            </w:pPr>
+            <w:r>
+              <w:t xml:space="preserve">Tarball install (</w:t>
+            </w:r>
+            <w:r>
+              <w:rPr>
+                <w:rStyle w:val="VerbatimChar"/>
+              </w:rPr>
+              <w:t xml:space="preserve">~/.local/lib</w:t>
+            </w:r>
+            <w:r>
+              <w:t xml:space="preserve">, non-root; npm fallback), pinned 4.117.0</w:t>
+            </w:r>
+          </w:p>
+        </w:tc>
+        <w:tc>
+          <w:tcPr/>
+          <w:p>
+            <w:pPr>
+              <w:pStyle w:val="Compact"/>
+            </w:pPr>
+            <w:r>
+              <w:t xml:space="preserve">editor/install</w:t>
+            </w:r>
+          </w:p>
+        </w:tc>
+        <w:tc>
+          <w:tcPr/>
+          <w:p>
+            <w:pPr>
+              <w:pStyle w:val="Compact"/>
+            </w:pPr>
+            <w:r>
+              <w:rPr>
+                <w:rStyle w:val="VerbatimChar"/>
+              </w:rPr>
+              <w:t xml:space="preserve">scripts/install-auth.sh</w:t>
+            </w:r>
+          </w:p>
+        </w:tc>
+        <w:tc>
+          <w:tcPr/>
+          <w:p>
+            <w:pPr>
+              <w:pStyle w:val="Compact"/>
+            </w:pPr>
+            <w:r>
+              <w:t xml:space="preserve">user-level install →</w:t>
+            </w:r>
+            <w:r>
+              <w:t xml:space="preserve"> </w:t>
+            </w:r>
+            <w:r>
+              <w:rPr>
+                <w:rStyle w:val="VerbatimChar"/>
+              </w:rPr>
+              <w:t xml:space="preserve">systemd --user</w:t>
+            </w:r>
+            <w:r>
+              <w:t xml:space="preserve"> </w:t>
+            </w:r>
+            <w:r>
+              <w:t xml:space="preserve">units</w:t>
+            </w:r>
+          </w:p>
+        </w:tc>
+        <w:tc>
+          <w:tcPr/>
+          <w:p>
+            <w:pPr>
+              <w:pStyle w:val="Compact"/>
+            </w:pPr>
+            <w:r>
+              <w:t xml:space="preserve">install verified (live editor serves 4.117.0)</w:t>
+            </w:r>
+          </w:p>
+        </w:tc>
+        <w:tc>
+          <w:tcPr/>
+          <w:p>
+            <w:pPr>
+              <w:pStyle w:val="Compact"/>
+            </w:pPr>
+            <w:r>
+              <w:t xml:space="preserve">(install/live)</w:t>
+            </w:r>
+          </w:p>
+        </w:tc>
+        <w:tc>
+          <w:tcPr/>
+          <w:p>
+            <w:pPr>
+              <w:pStyle w:val="Compact"/>
+            </w:pPr>
+            <w:r>
+              <w:t xml:space="preserve">PASS · changelog install + live editor 200</w:t>
+            </w:r>
+          </w:p>
+        </w:tc>
+        <w:tc>
+          <w:tcPr/>
+          <w:p>
+            <w:pPr>
+              <w:pStyle w:val="Compact"/>
+            </w:pPr>
+            <w:r>
+              <w:t xml:space="preserve">PENDING</w:t>
+            </w:r>
+          </w:p>
+        </w:tc>
+      </w:tr>
+      <w:tr>
+        <w:tc>
+          <w:tcPr/>
+          <w:p>
+            <w:pPr>
+              <w:pStyle w:val="Compact"/>
+            </w:pPr>
+            <w:r>
+              <w:t xml:space="preserve">code-server</w:t>
+            </w:r>
+          </w:p>
+        </w:tc>
+        <w:tc>
+          <w:tcPr/>
+          <w:p>
+            <w:pPr>
+              <w:pStyle w:val="Compact"/>
+            </w:pPr>
+            <w:r>
+              <w:t xml:space="preserve">Projects served read-write; Explorer defaults to</w:t>
+            </w:r>
+            <w:r>
+              <w:t xml:space="preserve"> </w:t>
+            </w:r>
+            <w:r>
+              <w:rPr>
+                <w:rStyle w:val="VerbatimChar"/>
+              </w:rPr>
+              <w:t xml:space="preserve">$PROJECTS_ROOT</w:t>
+            </w:r>
+            <w:r>
+              <w:t xml:space="preserve"> </w:t>
+            </w:r>
+            <w:r>
+              <w:t xml:space="preserve">(convenience view, NOT a jail)</w:t>
+            </w:r>
+          </w:p>
+        </w:tc>
+        <w:tc>
+          <w:tcPr/>
+          <w:p>
+            <w:pPr>
+              <w:pStyle w:val="Compact"/>
+            </w:pPr>
+            <w:r>
+              <w:t xml:space="preserve">editor</w:t>
+            </w:r>
+          </w:p>
+        </w:tc>
+        <w:tc>
+          <w:tcPr/>
+          <w:p>
+            <w:pPr>
+              <w:pStyle w:val="Compact"/>
+            </w:pPr>
+            <w:r>
+              <w:rPr>
+                <w:rStyle w:val="VerbatimChar"/>
+              </w:rPr>
+              <w:t xml:space="preserve">deploy/systemd/helix-code-server.service</w:t>
+            </w:r>
+            <w:r>
+              <w:t xml:space="preserve">,</w:t>
+            </w:r>
+            <w:r>
+              <w:t xml:space="preserve"> </w:t>
+            </w:r>
+            <w:r>
+              <w:rPr>
+                <w:rStyle w:val="VerbatimChar"/>
+              </w:rPr>
+              <w:t xml:space="preserve">deploy/.env</w:t>
+            </w:r>
+            <w:r>
+              <w:t xml:space="preserve"> </w:t>
+            </w:r>
+            <w:r>
+              <w:rPr>
+                <w:rStyle w:val="VerbatimChar"/>
+              </w:rPr>
+              <w:t xml:space="preserve">PROJECTS_ROOT</w:t>
+            </w:r>
+          </w:p>
+        </w:tc>
+        <w:tc>
+          <w:tcPr/>
+          <w:p>
+            <w:pPr>
+              <w:pStyle w:val="Compact"/>
+            </w:pPr>
+            <w:r>
+              <w:t xml:space="preserve">workspace/ExecStart</w:t>
+            </w:r>
+          </w:p>
+        </w:tc>
+        <w:tc>
+          <w:tcPr/>
+          <w:p>
+            <w:pPr>
+              <w:pStyle w:val="Compact"/>
+            </w:pPr>
+            <w:r>
+              <w:t xml:space="preserve">yes</w:t>
+            </w:r>
+          </w:p>
+        </w:tc>
+        <w:tc>
+          <w:tcPr/>
+          <w:p>
+            <w:pPr>
+              <w:pStyle w:val="Compact"/>
+            </w:pPr>
+            <w:r>
+              <w:t xml:space="preserve">challenges_auth (CH5), helixqa_auth</w:t>
+            </w:r>
+          </w:p>
+        </w:tc>
+        <w:tc>
+          <w:tcPr/>
+          <w:p>
+            <w:pPr>
+              <w:pStyle w:val="Compact"/>
+            </w:pPr>
+            <w:r>
+              <w:t xml:space="preserve">PASS ·</w:t>
+            </w:r>
+            <w:r>
+              <w:t xml:space="preserve"> </w:t>
+            </w:r>
+            <w:r>
+              <w:rPr>
+                <w:rStyle w:val="VerbatimChar"/>
+              </w:rPr>
+              <w:t xml:space="preserve">qa-results/tests/challenges_auth/20260701T151325Z-3188693/ch5_projects_root_default.txt</w:t>
+            </w:r>
+          </w:p>
+        </w:tc>
+        <w:tc>
+          <w:tcPr/>
+          <w:p>
+            <w:pPr>
+              <w:pStyle w:val="Compact"/>
+            </w:pPr>
+            <w:r>
+              <w:t xml:space="preserve">PENDING</w:t>
+            </w:r>
+          </w:p>
+        </w:tc>
+      </w:tr>
+      <w:tr>
+        <w:tc>
+          <w:tcPr/>
+          <w:p>
+            <w:pPr>
+              <w:pStyle w:val="Compact"/>
+            </w:pPr>
+            <w:r>
+              <w:t xml:space="preserve">code-server</w:t>
+            </w:r>
+          </w:p>
+        </w:tc>
+        <w:tc>
+          <w:tcPr/>
+          <w:p>
+            <w:pPr>
+              <w:pStyle w:val="Compact"/>
+            </w:pPr>
+            <w:r>
+              <w:t xml:space="preserve">SSH-key git from the integrated terminal (host</w:t>
+            </w:r>
+            <w:r>
+              <w:t xml:space="preserve"> </w:t>
+            </w:r>
+            <w:r>
+              <w:rPr>
+                <w:rStyle w:val="VerbatimChar"/>
+              </w:rPr>
+              <w:t xml:space="preserve">~/.ssh</w:t>
+            </w:r>
+            <w:r>
+              <w:t xml:space="preserve">)</w:t>
+            </w:r>
+          </w:p>
+        </w:tc>
+        <w:tc>
+          <w:tcPr/>
+          <w:p>
+            <w:pPr>
+              <w:pStyle w:val="Compact"/>
+            </w:pPr>
+            <w:r>
+              <w:t xml:space="preserve">editor/env</w:t>
+            </w:r>
+          </w:p>
+        </w:tc>
+        <w:tc>
+          <w:tcPr/>
+          <w:p>
+            <w:pPr>
+              <w:pStyle w:val="Compact"/>
+            </w:pPr>
+            <w:r>
+              <w:t xml:space="preserve">host-native as real user</w:t>
+            </w:r>
+          </w:p>
+        </w:tc>
+        <w:tc>
+          <w:tcPr/>
+          <w:p>
+            <w:pPr>
+              <w:pStyle w:val="Compact"/>
+            </w:pPr>
+            <w:r>
+              <w:t xml:space="preserve">login shell inherits</w:t>
+            </w:r>
+            <w:r>
+              <w:t xml:space="preserve"> </w:t>
+            </w:r>
+            <w:r>
+              <w:rPr>
+                <w:rStyle w:val="VerbatimChar"/>
+              </w:rPr>
+              <w:t xml:space="preserve">~/.ssh</w:t>
+            </w:r>
+          </w:p>
+        </w:tc>
+        <w:tc>
+          <w:tcPr/>
+          <w:p>
+            <w:pPr>
+              <w:pStyle w:val="Compact"/>
+            </w:pPr>
+            <w:r>
+              <w:t xml:space="preserve">yes —</w:t>
+            </w:r>
+            <w:r>
+              <w:t xml:space="preserve"> </w:t>
+            </w:r>
+            <w:r>
+              <w:rPr>
+                <w:rStyle w:val="VerbatimChar"/>
+              </w:rPr>
+              <w:t xml:space="preserve">git ls-remote</w:t>
+            </w:r>
+            <w:r>
+              <w:t xml:space="preserve"> </w:t>
+            </w:r>
+            <w:r>
+              <w:t xml:space="preserve">returned 5 refs</w:t>
+            </w:r>
+          </w:p>
+        </w:tc>
+        <w:tc>
+          <w:tcPr/>
+          <w:p>
+            <w:pPr>
+              <w:pStyle w:val="Compact"/>
+            </w:pPr>
+            <w:r>
+              <w:t xml:space="preserve">challenges_auth (CH3)</w:t>
+            </w:r>
+          </w:p>
+        </w:tc>
+        <w:tc>
+          <w:tcPr/>
+          <w:p>
+            <w:pPr>
+              <w:pStyle w:val="Compact"/>
+            </w:pPr>
+            <w:r>
+              <w:t xml:space="preserve">PASS ·</w:t>
+            </w:r>
+            <w:r>
+              <w:t xml:space="preserve"> </w:t>
+            </w:r>
+            <w:r>
+              <w:rPr>
+                <w:rStyle w:val="VerbatimChar"/>
+              </w:rPr>
+              <w:t xml:space="preserve">qa-results/tests/challenges_auth/20260701T151325Z-3188693/ch3_git_lsremote.txt</w:t>
+            </w:r>
+          </w:p>
+        </w:tc>
+        <w:tc>
+          <w:tcPr/>
+          <w:p>
+            <w:pPr>
+              <w:pStyle w:val="Compact"/>
+            </w:pPr>
+            <w:r>
+              <w:t xml:space="preserve">PENDING</w:t>
+            </w:r>
+          </w:p>
+        </w:tc>
+      </w:tr>
+      <w:tr>
+        <w:tc>
+          <w:tcPr/>
+          <w:p>
+            <w:pPr>
+              <w:pStyle w:val="Compact"/>
+            </w:pPr>
+            <w:r>
+              <w:t xml:space="preserve">code-server</w:t>
+            </w:r>
+          </w:p>
+        </w:tc>
+        <w:tc>
+          <w:tcPr/>
+          <w:p>
+            <w:pPr>
+              <w:pStyle w:val="Compact"/>
+            </w:pPr>
+            <w:r>
+              <w:rPr>
+                <w:rStyle w:val="VerbatimChar"/>
+              </w:rPr>
+              <w:t xml:space="preserve">.bashrc</w:t>
+            </w:r>
+            <w:r>
+              <w:t xml:space="preserve"> </w:t>
+            </w:r>
+            <w:r>
+              <w:t xml:space="preserve">/ profile sourced in fresh terminal</w:t>
+            </w:r>
+          </w:p>
+        </w:tc>
+        <w:tc>
+          <w:tcPr/>
+          <w:p>
+            <w:pPr>
+              <w:pStyle w:val="Compact"/>
+            </w:pPr>
+            <w:r>
+              <w:t xml:space="preserve">editor/env</w:t>
+            </w:r>
+          </w:p>
+        </w:tc>
+        <w:tc>
+          <w:tcPr/>
+          <w:p>
+            <w:pPr>
+              <w:pStyle w:val="Compact"/>
+            </w:pPr>
+            <w:r>
+              <w:t xml:space="preserve">host-native as real user</w:t>
+            </w:r>
+          </w:p>
+        </w:tc>
+        <w:tc>
+          <w:tcPr/>
+          <w:p>
+            <w:pPr>
+              <w:pStyle w:val="Compact"/>
+            </w:pPr>
+            <w:r>
+              <w:t xml:space="preserve">login shell (</w:t>
+            </w:r>
+            <w:r>
+              <w:rPr>
+                <w:rStyle w:val="VerbatimChar"/>
+              </w:rPr>
+              <w:t xml:space="preserve">bash -l</w:t>
+            </w:r>
+            <w:r>
+              <w:t xml:space="preserve">)</w:t>
+            </w:r>
+          </w:p>
+        </w:tc>
+        <w:tc>
+          <w:tcPr/>
+          <w:p>
+            <w:pPr>
+              <w:pStyle w:val="Compact"/>
+            </w:pPr>
+            <w:r>
+              <w:t xml:space="preserve">yes —</w:t>
+            </w:r>
+            <w:r>
+              <w:t xml:space="preserve"> </w:t>
+            </w:r>
+            <w:r>
+              <w:rPr>
+                <w:rStyle w:val="VerbatimChar"/>
+              </w:rPr>
+              <w:t xml:space="preserve">$OSH</w:t>
+            </w:r>
+            <w:r>
+              <w:t xml:space="preserve"> </w:t>
+            </w:r>
+            <w:r>
+              <w:t xml:space="preserve">export present</w:t>
+            </w:r>
+          </w:p>
+        </w:tc>
+        <w:tc>
+          <w:tcPr/>
+          <w:p>
+            <w:pPr>
+              <w:pStyle w:val="Compact"/>
+            </w:pPr>
+            <w:r>
+              <w:t xml:space="preserve">challenges_auth (CH4)</w:t>
+            </w:r>
+          </w:p>
+        </w:tc>
+        <w:tc>
+          <w:tcPr/>
+          <w:p>
+            <w:pPr>
+              <w:pStyle w:val="Compact"/>
+            </w:pPr>
+            <w:r>
+              <w:t xml:space="preserve">PASS ·</w:t>
+            </w:r>
+            <w:r>
+              <w:t xml:space="preserve"> </w:t>
+            </w:r>
+            <w:r>
+              <w:rPr>
+                <w:rStyle w:val="VerbatimChar"/>
+              </w:rPr>
+              <w:t xml:space="preserve">qa-results/tests/challenges_auth/20260701T151325Z-3188693/ch4_bashrc_exports.txt</w:t>
+            </w:r>
+          </w:p>
+        </w:tc>
+        <w:tc>
+          <w:tcPr/>
+          <w:p>
+            <w:pPr>
+              <w:pStyle w:val="Compact"/>
+            </w:pPr>
+            <w:r>
+              <w:t xml:space="preserve">PENDING</w:t>
+            </w:r>
+          </w:p>
+        </w:tc>
+      </w:tr>
+      <w:tr>
+        <w:tc>
+          <w:tcPr/>
+          <w:p>
+            <w:pPr>
+              <w:pStyle w:val="Compact"/>
+            </w:pPr>
+            <w:r>
+              <w:t xml:space="preserve">code-server</w:t>
+            </w:r>
+          </w:p>
+        </w:tc>
+        <w:tc>
+          <w:tcPr/>
+          <w:p>
+            <w:pPr>
+              <w:pStyle w:val="Compact"/>
+            </w:pPr>
+            <w:r>
+              <w:t xml:space="preserve">Extension (plugin) install + use from Open VSX marketplace</w:t>
+            </w:r>
+          </w:p>
+        </w:tc>
+        <w:tc>
+          <w:tcPr/>
+          <w:p>
+            <w:pPr>
+              <w:pStyle w:val="Compact"/>
+            </w:pPr>
+            <w:r>
+              <w:t xml:space="preserve">editor/extensions</w:t>
+            </w:r>
+          </w:p>
+        </w:tc>
+        <w:tc>
+          <w:tcPr/>
+          <w:p>
+            <w:pPr>
+              <w:pStyle w:val="Compact"/>
+            </w:pPr>
+            <w:r>
+              <w:rPr>
+                <w:rStyle w:val="VerbatimChar"/>
+              </w:rPr>
+              <w:t xml:space="preserve">tests/types/extensions_auth.sh</w:t>
+            </w:r>
+            <w:r>
+              <w:t xml:space="preserve">, bank</w:t>
+            </w:r>
+            <w:r>
+              <w:t xml:space="preserve"> </w:t>
+            </w:r>
+            <w:r>
+              <w:rPr>
+                <w:rStyle w:val="VerbatimChar"/>
+              </w:rPr>
+              <w:t xml:space="preserve">tests/banks/helixcode-extensions.yaml</w:t>
+            </w:r>
+          </w:p>
+        </w:tc>
+        <w:tc>
+          <w:tcPr/>
+          <w:p>
+            <w:pPr>
+              <w:pStyle w:val="Compact"/>
+            </w:pPr>
+            <w:r>
+              <w:t xml:space="preserve">code-server extension host; throwaway</w:t>
+            </w:r>
+            <w:r>
+              <w:t xml:space="preserve"> </w:t>
+            </w:r>
+            <w:r>
+              <w:rPr>
+                <w:rStyle w:val="VerbatimChar"/>
+              </w:rPr>
+              <w:t xml:space="preserve">--extensions-dir</w:t>
+            </w:r>
+            <w:r>
+              <w:t xml:space="preserve"> </w:t>
+            </w:r>
+            <w:r>
+              <w:t xml:space="preserve">(live dir untouched)</w:t>
+            </w:r>
+          </w:p>
+        </w:tc>
+        <w:tc>
+          <w:tcPr/>
+          <w:p>
+            <w:pPr>
+              <w:pStyle w:val="Compact"/>
+            </w:pPr>
+            <w:r>
+              <w:t xml:space="preserve">yes — live install (</w:t>
+            </w:r>
+            <w:r>
+              <w:rPr>
+                <w:rStyle w:val="VerbatimChar"/>
+              </w:rPr>
+              <w:t xml:space="preserve">redhat/vscode-yaml@1.24.…</w:t>
+            </w:r>
+            <w:r>
+              <w:t xml:space="preserve">), manifest + extension-host load</w:t>
+            </w:r>
+          </w:p>
+        </w:tc>
+        <w:tc>
+          <w:tcPr/>
+          <w:p>
+            <w:pPr>
+              <w:pStyle w:val="Compact"/>
+            </w:pPr>
+            <w:r>
+              <w:t xml:space="preserve">e2e/full-automation, Challenges</w:t>
+            </w:r>
+          </w:p>
+        </w:tc>
+        <w:tc>
+          <w:tcPr/>
+          <w:p>
+            <w:pPr>
+              <w:pStyle w:val="Compact"/>
+            </w:pPr>
+            <w:r>
+              <w:t xml:space="preserve">PASS · 5/5 checks captured</w:t>
+            </w:r>
+            <w:r>
+              <w:t xml:space="preserve"> </w:t>
+            </w:r>
+            <w:r>
+              <w:rPr>
+                <w:rStyle w:val="VerbatimChar"/>
+              </w:rPr>
+              <w:t xml:space="preserve">qa-results/tests/extensions_auth/20260701T162817Z-4080597</w:t>
+            </w:r>
+            <w:r>
+              <w:t xml:space="preserve"> </w:t>
+            </w:r>
+            <w:r>
+              <w:t xml:space="preserve">(x1 Open VSX 200 → x4 cleanup)</w:t>
+            </w:r>
+          </w:p>
+        </w:tc>
+        <w:tc>
+          <w:tcPr/>
+          <w:p>
+            <w:pPr>
+              <w:pStyle w:val="Compact"/>
+            </w:pPr>
+            <w:r>
+              <w:t xml:space="preserve">PENDING</w:t>
+            </w:r>
+          </w:p>
+        </w:tc>
+      </w:tr>
+      <w:tr>
+        <w:tc>
+          <w:tcPr/>
+          <w:p>
+            <w:pPr>
+              <w:pStyle w:val="Compact"/>
+            </w:pPr>
+            <w:r>
+              <w:t xml:space="preserve">code-server</w:t>
+            </w:r>
+          </w:p>
+        </w:tc>
+        <w:tc>
+          <w:tcPr/>
+          <w:p>
+            <w:pPr>
+              <w:pStyle w:val="Compact"/>
+            </w:pPr>
+            <w:r>
+              <w:t xml:space="preserve">VS Code Dark enforced as DEFAULT theme ("Visual Studio Dark", every fresh install)</w:t>
+            </w:r>
+          </w:p>
+        </w:tc>
+        <w:tc>
+          <w:tcPr/>
+          <w:p>
+            <w:pPr>
+              <w:pStyle w:val="Compact"/>
+            </w:pPr>
+            <w:r>
+              <w:t xml:space="preserve">editor/ux</w:t>
+            </w:r>
+          </w:p>
+        </w:tc>
+        <w:tc>
+          <w:tcPr/>
+          <w:p>
+            <w:pPr>
+              <w:pStyle w:val="Compact"/>
+            </w:pPr>
+            <w:r>
+              <w:rPr>
+                <w:rStyle w:val="VerbatimChar"/>
+              </w:rPr>
+              <w:t xml:space="preserve">deploy/code-server/settings.default.json</w:t>
+            </w:r>
+            <w:r>
+              <w:t xml:space="preserve"> </w:t>
+            </w:r>
+            <w:r>
+              <w:t xml:space="preserve">(commit</w:t>
+            </w:r>
+            <w:r>
+              <w:t xml:space="preserve"> </w:t>
+            </w:r>
+            <w:r>
+              <w:rPr>
+                <w:rStyle w:val="VerbatimChar"/>
+              </w:rPr>
+              <w:t xml:space="preserve">97a8c69</w:t>
+            </w:r>
+            <w:r>
+              <w:t xml:space="preserve">)</w:t>
+            </w:r>
+          </w:p>
+        </w:tc>
+        <w:tc>
+          <w:tcPr/>
+          <w:p>
+            <w:pPr>
+              <w:pStyle w:val="Compact"/>
+            </w:pPr>
+            <w:r>
+              <w:t xml:space="preserve">seeded into</w:t>
+            </w:r>
+            <w:r>
+              <w:t xml:space="preserve"> </w:t>
+            </w:r>
+            <w:r>
+              <w:rPr>
+                <w:rStyle w:val="VerbatimChar"/>
+              </w:rPr>
+              <w:t xml:space="preserve">User/settings.json</w:t>
+            </w:r>
+            <w:r>
+              <w:t xml:space="preserve"> </w:t>
+            </w:r>
+            <w:r>
+              <w:t xml:space="preserve">on install; live deployment enforces it</w:t>
+            </w:r>
+          </w:p>
+        </w:tc>
+        <w:tc>
+          <w:tcPr/>
+          <w:p>
+            <w:pPr>
+              <w:pStyle w:val="Compact"/>
+            </w:pPr>
+            <w:r>
+              <w:t xml:space="preserve">yes — config 3/3 + §11.4.170 host-rendered pixel proof</w:t>
+            </w:r>
+          </w:p>
+        </w:tc>
+        <w:tc>
+          <w:tcPr/>
+          <w:p>
+            <w:pPr>
+              <w:pStyle w:val="Compact"/>
+            </w:pPr>
+            <w:r>
+              <w:rPr>
+                <w:rStyle w:val="VerbatimChar"/>
+              </w:rPr>
+              <w:t xml:space="preserve">theme_default_auth.sh</w:t>
+            </w:r>
+            <w:r>
+              <w:t xml:space="preserve"> </w:t>
+            </w:r>
+            <w:r>
+              <w:t xml:space="preserve">(config 3/3),</w:t>
+            </w:r>
+            <w:r>
+              <w:t xml:space="preserve"> </w:t>
+            </w:r>
+            <w:r>
+              <w:rPr>
+                <w:rStyle w:val="VerbatimChar"/>
+              </w:rPr>
+              <w:t xml:space="preserve">theme_visual_auth.sh</w:t>
+            </w:r>
+            <w:r>
+              <w:t xml:space="preserve"> </w:t>
+            </w:r>
+            <w:r>
+              <w:t xml:space="preserve">+</w:t>
+            </w:r>
+            <w:r>
+              <w:t xml:space="preserve"> </w:t>
+            </w:r>
+            <w:r>
+              <w:rPr>
+                <w:rStyle w:val="VerbatimChar"/>
+              </w:rPr>
+              <w:t xml:space="preserve">theme_visual_cdp.mjs</w:t>
+            </w:r>
+            <w:r>
+              <w:t xml:space="preserve"> </w:t>
+            </w:r>
+            <w:r>
+              <w:t xml:space="preserve">(rendered pixels)</w:t>
+            </w:r>
+          </w:p>
+        </w:tc>
+        <w:tc>
+          <w:tcPr/>
+          <w:p>
+            <w:pPr>
+              <w:pStyle w:val="Compact"/>
+            </w:pPr>
+            <w:r>
+              <w:t xml:space="preserve">PASS · config</w:t>
+            </w:r>
+            <w:r>
+              <w:t xml:space="preserve"> </w:t>
+            </w:r>
+            <w:r>
+              <w:rPr>
+                <w:rStyle w:val="VerbatimChar"/>
+              </w:rPr>
+              <w:t xml:space="preserve">Visual Studio Dark</w:t>
+            </w:r>
+            <w:r>
+              <w:t xml:space="preserve"> </w:t>
+            </w:r>
+            <w:r>
+              <w:t xml:space="preserve">seed/fresh/live 3/3</w:t>
+            </w:r>
+            <w:r>
+              <w:t xml:space="preserve"> </w:t>
+            </w:r>
+            <w:r>
+              <w:rPr>
+                <w:rStyle w:val="VerbatimChar"/>
+              </w:rPr>
+              <w:t xml:space="preserve">qa-results/tests/theme_default_auth/20260701T184655Z-1071563</w:t>
+            </w:r>
+            <w:r>
+              <w:t xml:space="preserve"> </w:t>
+            </w:r>
+            <w:r>
+              <w:t xml:space="preserve">+ §11.4.170 dark pixel proof meanLum</w:t>
+            </w:r>
+            <w:r>
+              <w:t xml:space="preserve"> </w:t>
+            </w:r>
             <w:r>
               <w:rPr>
                 <w:b/>
                 <w:bCs/>
               </w:rPr>
-              <w:t xml:space="preserve">in progress</w:t>
-            </w:r>
-          </w:p>
-        </w:tc>
-        <w:tc>
-          <w:tcPr/>
-          <w:p>
-            <w:pPr>
-              <w:pStyle w:val="Compact"/>
-            </w:pPr>
-            <w:r>
-              <w:t xml:space="preserve">(UI-driven test in progress)</w:t>
-            </w:r>
-          </w:p>
-        </w:tc>
-        <w:tc>
-          <w:tcPr/>
-          <w:p>
-            <w:pPr>
-              <w:pStyle w:val="Compact"/>
-            </w:pPr>
-            <w:r>
-              <w:t xml:space="preserve">PENDING · source landed; NOT yet validated (subagent in flight)</w:t>
+              <w:t xml:space="preserve">44.3</w:t>
+            </w:r>
+            <w:r>
+              <w:t xml:space="preserve"> </w:t>
+            </w:r>
+            <w:r>
+              <w:t xml:space="preserve">(darkFrac 0.926, DOM</w:t>
+            </w:r>
+            <w:r>
+              <w:t xml:space="preserve"> </w:t>
+            </w:r>
+            <w:r>
+              <w:rPr>
+                <w:rStyle w:val="VerbatimChar"/>
+              </w:rPr>
+              <w:t xml:space="preserve">vs-dark</w:t>
+            </w:r>
+            <w:r>
+              <w:t xml:space="preserve">, bg</w:t>
+            </w:r>
+            <w:r>
+              <w:t xml:space="preserve"> </w:t>
+            </w:r>
+            <w:r>
+              <w:rPr>
+                <w:rStyle w:val="VerbatimChar"/>
+              </w:rPr>
+              <w:t xml:space="preserve">rgb(37,37,38)</w:t>
+            </w:r>
+            <w:r>
+              <w:t xml:space="preserve">)</w:t>
+            </w:r>
+            <w:r>
+              <w:t xml:space="preserve"> </w:t>
+            </w:r>
+            <w:r>
+              <w:rPr>
+                <w:rStyle w:val="VerbatimChar"/>
+              </w:rPr>
+              <w:t xml:space="preserve">qa-results/tests/theme_visual_auth/20260701T183729Z-1053274</w:t>
+            </w:r>
+            <w:r>
+              <w:t xml:space="preserve"> </w:t>
+            </w:r>
+            <w:r>
+              <w:t xml:space="preserve">vs RED light-control meanLum</w:t>
+            </w:r>
+            <w:r>
+              <w:t xml:space="preserve"> </w:t>
+            </w:r>
+            <w:r>
+              <w:rPr>
+                <w:b/>
+                <w:bCs/>
+              </w:rPr>
+              <w:t xml:space="preserve">228.5</w:t>
+            </w:r>
+            <w:r>
+              <w:t xml:space="preserve"> </w:t>
+            </w:r>
+            <w:r>
+              <w:rPr>
+                <w:rStyle w:val="VerbatimChar"/>
+              </w:rPr>
+              <w:t xml:space="preserve">…/20260701T183816Z-1053829</w:t>
+            </w:r>
+            <w:r>
+              <w:t xml:space="preserve"> </w:t>
+            </w:r>
+            <w:r>
+              <w:t xml:space="preserve">(self-validated golden-good/golden-bad §11.4.107(10))</w:t>
             </w:r>
           </w:p>
         </w:tc>
@@ -3221,118 +4662,161 @@
               <w:pStyle w:val="Compact"/>
             </w:pPr>
             <w:r>
-              <w:t xml:space="preserve">Host-native editor served (authed 200,</w:t>
-            </w:r>
-            <w:r>
-              <w:t xml:space="preserve"> </w:t>
-            </w:r>
-            <w:r>
-              <w:rPr>
-                <w:rStyle w:val="VerbatimChar"/>
-              </w:rPr>
-              <w:t xml:space="preserve">X-Helix-User: milosvasic</w:t>
-            </w:r>
-            <w:r>
-              <w:t xml:space="preserve">)</w:t>
-            </w:r>
-          </w:p>
-        </w:tc>
-        <w:tc>
-          <w:tcPr/>
-          <w:p>
-            <w:pPr>
-              <w:pStyle w:val="Compact"/>
-            </w:pPr>
-            <w:r>
-              <w:t xml:space="preserve">editor</w:t>
-            </w:r>
-          </w:p>
-        </w:tc>
-        <w:tc>
-          <w:tcPr/>
-          <w:p>
-            <w:pPr>
-              <w:pStyle w:val="Compact"/>
-            </w:pPr>
-            <w:r>
-              <w:rPr>
-                <w:rStyle w:val="VerbatimChar"/>
-              </w:rPr>
-              <w:t xml:space="preserve">deploy/systemd/helix-code-server.service</w:t>
-            </w:r>
-          </w:p>
-        </w:tc>
-        <w:tc>
-          <w:tcPr/>
-          <w:p>
-            <w:pPr>
-              <w:pStyle w:val="Compact"/>
-            </w:pPr>
-            <w:r>
-              <w:rPr>
-                <w:rStyle w:val="VerbatimChar"/>
-              </w:rPr>
-              <w:t xml:space="preserve">systemd --user</w:t>
-            </w:r>
-            <w:r>
-              <w:t xml:space="preserve"> </w:t>
-            </w:r>
-            <w:r>
-              <w:t xml:space="preserve">as</w:t>
-            </w:r>
-            <w:r>
-              <w:t xml:space="preserve"> </w:t>
-            </w:r>
-            <w:r>
-              <w:rPr>
-                <w:rStyle w:val="VerbatimChar"/>
-              </w:rPr>
-              <w:t xml:space="preserve">milosvasic</w:t>
-            </w:r>
-            <w:r>
-              <w:t xml:space="preserve">, Caddy reverse_proxy</w:t>
-            </w:r>
-          </w:p>
-        </w:tc>
-        <w:tc>
-          <w:tcPr/>
-          <w:p>
-            <w:pPr>
-              <w:pStyle w:val="Compact"/>
-            </w:pPr>
-            <w:r>
-              <w:t xml:space="preserve">yes</w:t>
-            </w:r>
-          </w:p>
-        </w:tc>
-        <w:tc>
-          <w:tcPr/>
-          <w:p>
-            <w:pPr>
-              <w:pStyle w:val="Compact"/>
-            </w:pPr>
-            <w:r>
-              <w:t xml:space="preserve">e2e_auth (D), challenges_auth (CH1), helixqa_auth (QA-004)</w:t>
-            </w:r>
-          </w:p>
-        </w:tc>
-        <w:tc>
-          <w:tcPr/>
-          <w:p>
-            <w:pPr>
-              <w:pStyle w:val="Compact"/>
-            </w:pPr>
-            <w:r>
-              <w:t xml:space="preserve">PASS · editor loads (9 markers)</w:t>
-            </w:r>
-            <w:r>
-              <w:t xml:space="preserve"> </w:t>
-            </w:r>
-            <w:r>
-              <w:rPr>
-                <w:rStyle w:val="VerbatimChar"/>
-              </w:rPr>
-              <w:t xml:space="preserve">qa-results/tests/challenges_auth/20260701T151325Z-3188693/ch1_sshkey_login.txt</w:t>
+              <w:t xml:space="preserve">Popular extensions install + loadable + persist across restart + config round-trip (Open VSX)</w:t>
+            </w:r>
+          </w:p>
+        </w:tc>
+        <w:tc>
+          <w:tcPr/>
+          <w:p>
+            <w:pPr>
+              <w:pStyle w:val="Compact"/>
+            </w:pPr>
+            <w:r>
+              <w:t xml:space="preserve">editor/extensions</w:t>
+            </w:r>
+          </w:p>
+        </w:tc>
+        <w:tc>
+          <w:tcPr/>
+          <w:p>
+            <w:pPr>
+              <w:pStyle w:val="Compact"/>
+            </w:pPr>
+            <w:r>
+              <w:rPr>
+                <w:rStyle w:val="VerbatimChar"/>
+              </w:rPr>
+              <w:t xml:space="preserve">tests/types/extensions_popular_auth.sh</w:t>
+            </w:r>
+            <w:r>
+              <w:t xml:space="preserve">, bank</w:t>
+            </w:r>
+            <w:r>
+              <w:t xml:space="preserve"> </w:t>
+            </w:r>
+            <w:r>
+              <w:rPr>
+                <w:rStyle w:val="VerbatimChar"/>
+              </w:rPr>
+              <w:t xml:space="preserve">tests/banks/helixcode-extensions.yaml</w:t>
+            </w:r>
+          </w:p>
+        </w:tc>
+        <w:tc>
+          <w:tcPr/>
+          <w:p>
+            <w:pPr>
+              <w:pStyle w:val="Compact"/>
+            </w:pPr>
+            <w:r>
+              <w:t xml:space="preserve">code-server extension host; throwaway</w:t>
+            </w:r>
+            <w:r>
+              <w:t xml:space="preserve"> </w:t>
+            </w:r>
+            <w:r>
+              <w:rPr>
+                <w:rStyle w:val="VerbatimChar"/>
+              </w:rPr>
+              <w:t xml:space="preserve">--extensions-dir</w:t>
+            </w:r>
+            <w:r>
+              <w:t xml:space="preserve"> </w:t>
+            </w:r>
+            <w:r>
+              <w:t xml:space="preserve">(live dir untouched)</w:t>
+            </w:r>
+          </w:p>
+        </w:tc>
+        <w:tc>
+          <w:tcPr/>
+          <w:p>
+            <w:pPr>
+              <w:pStyle w:val="Compact"/>
+            </w:pPr>
+            <w:r>
+              <w:t xml:space="preserve">yes — live probe installed 8 popular exts (Python/ESLint/Prettier/GitLens/etc.) + persisted across a new PID</w:t>
+            </w:r>
+          </w:p>
+        </w:tc>
+        <w:tc>
+          <w:tcPr/>
+          <w:p>
+            <w:pPr>
+              <w:pStyle w:val="Compact"/>
+            </w:pPr>
+            <w:r>
+              <w:t xml:space="preserve">e2e/full-automation, Challenges</w:t>
+            </w:r>
+          </w:p>
+        </w:tc>
+        <w:tc>
+          <w:tcPr/>
+          <w:p>
+            <w:pPr>
+              <w:pStyle w:val="Compact"/>
+            </w:pPr>
+            <w:r>
+              <w:t xml:space="preserve">PASS · install proven live 4/5</w:t>
+            </w:r>
+            <w:r>
+              <w:t xml:space="preserve"> </w:t>
+            </w:r>
+            <w:r>
+              <w:rPr>
+                <w:rStyle w:val="VerbatimChar"/>
+              </w:rPr>
+              <w:t xml:space="preserve">qa-results/tests/extensions_popular_auth/20260701T181018Z-855046/p1_install.txt</w:t>
+            </w:r>
+            <w:r>
+              <w:t xml:space="preserve"> </w:t>
+            </w:r>
+            <w:r>
+              <w:t xml:space="preserve">(+ commit</w:t>
+            </w:r>
+            <w:r>
+              <w:t xml:space="preserve"> </w:t>
+            </w:r>
+            <w:r>
+              <w:rPr>
+                <w:rStyle w:val="VerbatimChar"/>
+              </w:rPr>
+              <w:t xml:space="preserve">97a8c69</w:t>
+            </w:r>
+            <w:r>
+              <w:t xml:space="preserve"> </w:t>
+            </w:r>
+            <w:r>
+              <w:t xml:space="preserve">direct 8-ext probe) + config round-trip OK</w:t>
+            </w:r>
+            <w:r>
+              <w:t xml:space="preserve"> </w:t>
+            </w:r>
+            <w:r>
+              <w:rPr>
+                <w:rStyle w:val="VerbatimChar"/>
+              </w:rPr>
+              <w:t xml:space="preserve">…/20260701T185541Z-1084353/p4_config.txt</w:t>
+            </w:r>
+            <w:r>
+              <w:t xml:space="preserve">; MS-proprietary (Pylance/Live Share/Remote) honestly ABSENT from Open VSX (§11.4.112).</w:t>
+            </w:r>
+            <w:r>
+              <w:t xml:space="preserve"> </w:t>
+            </w:r>
+            <w:r>
+              <w:rPr>
+                <w:b/>
+                <w:bCs/>
+              </w:rPr>
+              <w:t xml:space="preserve">Network-dependent SKIP caveat (§11.4.6):</w:t>
+            </w:r>
+            <w:r>
+              <w:t xml:space="preserve"> </w:t>
+            </w:r>
+            <w:r>
+              <w:t xml:space="preserve">install/loadable/persist steps require a reachable Open VSX — later runs with Open VSX unreachable installed 0 (bounded, honest network-SKIP, not a product FAIL)</w:t>
             </w:r>
           </w:p>
         </w:tc>
@@ -3367,100 +4851,88 @@
               <w:pStyle w:val="Compact"/>
             </w:pPr>
             <w:r>
-              <w:t xml:space="preserve">Tarball install (</w:t>
-            </w:r>
-            <w:r>
-              <w:rPr>
-                <w:rStyle w:val="VerbatimChar"/>
-              </w:rPr>
-              <w:t xml:space="preserve">~/.local/lib</w:t>
-            </w:r>
-            <w:r>
-              <w:t xml:space="preserve">, non-root; npm fallback), pinned 4.117.0</w:t>
-            </w:r>
-          </w:p>
-        </w:tc>
-        <w:tc>
-          <w:tcPr/>
-          <w:p>
-            <w:pPr>
-              <w:pStyle w:val="Compact"/>
-            </w:pPr>
-            <w:r>
-              <w:t xml:space="preserve">editor/install</w:t>
-            </w:r>
-          </w:p>
-        </w:tc>
-        <w:tc>
-          <w:tcPr/>
-          <w:p>
-            <w:pPr>
-              <w:pStyle w:val="Compact"/>
-            </w:pPr>
-            <w:r>
-              <w:rPr>
-                <w:rStyle w:val="VerbatimChar"/>
-              </w:rPr>
-              <w:t xml:space="preserve">scripts/install-auth.sh</w:t>
-            </w:r>
-          </w:p>
-        </w:tc>
-        <w:tc>
-          <w:tcPr/>
-          <w:p>
-            <w:pPr>
-              <w:pStyle w:val="Compact"/>
-            </w:pPr>
-            <w:r>
-              <w:t xml:space="preserve">user-level install →</w:t>
-            </w:r>
-            <w:r>
-              <w:t xml:space="preserve"> </w:t>
-            </w:r>
-            <w:r>
-              <w:rPr>
-                <w:rStyle w:val="VerbatimChar"/>
-              </w:rPr>
-              <w:t xml:space="preserve">systemd --user</w:t>
-            </w:r>
-            <w:r>
-              <w:t xml:space="preserve"> </w:t>
-            </w:r>
-            <w:r>
-              <w:t xml:space="preserve">units</w:t>
-            </w:r>
-          </w:p>
-        </w:tc>
-        <w:tc>
-          <w:tcPr/>
-          <w:p>
-            <w:pPr>
-              <w:pStyle w:val="Compact"/>
-            </w:pPr>
-            <w:r>
-              <w:t xml:space="preserve">install verified (live editor serves 4.117.0)</w:t>
-            </w:r>
-          </w:p>
-        </w:tc>
-        <w:tc>
-          <w:tcPr/>
-          <w:p>
-            <w:pPr>
-              <w:pStyle w:val="Compact"/>
-            </w:pPr>
-            <w:r>
-              <w:t xml:space="preserve">(install/live)</w:t>
-            </w:r>
-          </w:p>
-        </w:tc>
-        <w:tc>
-          <w:tcPr/>
-          <w:p>
-            <w:pPr>
-              <w:pStyle w:val="Compact"/>
-            </w:pPr>
-            <w:r>
-              <w:t xml:space="preserve">PASS · changelog install + live editor 200</w:t>
+              <w:t xml:space="preserve">In-browser editing (type/save via UI, file tree, command palette)</w:t>
+            </w:r>
+          </w:p>
+        </w:tc>
+        <w:tc>
+          <w:tcPr/>
+          <w:p>
+            <w:pPr>
+              <w:pStyle w:val="Compact"/>
+            </w:pPr>
+            <w:r>
+              <w:t xml:space="preserve">editor/ui</w:t>
+            </w:r>
+          </w:p>
+        </w:tc>
+        <w:tc>
+          <w:tcPr/>
+          <w:p>
+            <w:pPr>
+              <w:pStyle w:val="Compact"/>
+            </w:pPr>
+            <w:r>
+              <w:t xml:space="preserve">code-server workbench</w:t>
+            </w:r>
+          </w:p>
+        </w:tc>
+        <w:tc>
+          <w:tcPr/>
+          <w:p>
+            <w:pPr>
+              <w:pStyle w:val="Compact"/>
+            </w:pPr>
+            <w:r>
+              <w:t xml:space="preserve">browser websocket</w:t>
+            </w:r>
+          </w:p>
+        </w:tc>
+        <w:tc>
+          <w:tcPr/>
+          <w:p>
+            <w:pPr>
+              <w:pStyle w:val="Compact"/>
+            </w:pPr>
+            <w:r>
+              <w:t xml:space="preserve">—</w:t>
+            </w:r>
+          </w:p>
+        </w:tc>
+        <w:tc>
+          <w:tcPr/>
+          <w:p>
+            <w:pPr>
+              <w:pStyle w:val="Compact"/>
+            </w:pPr>
+            <w:r>
+              <w:t xml:space="preserve">helixqa_auth (HCA-QA-UI-001)</w:t>
+            </w:r>
+          </w:p>
+        </w:tc>
+        <w:tc>
+          <w:tcPr/>
+          <w:p>
+            <w:pPr>
+              <w:pStyle w:val="Compact"/>
+            </w:pPr>
+            <w:r>
+              <w:t xml:space="preserve">OPERATOR-ATTENDED · SKIP</w:t>
+            </w:r>
+            <w:r>
+              <w:t xml:space="preserve"> </w:t>
+            </w:r>
+            <w:r>
+              <w:rPr>
+                <w:rStyle w:val="VerbatimChar"/>
+              </w:rPr>
+              <w:t xml:space="preserve">operator_attended</w:t>
+            </w:r>
+            <w:r>
+              <w:t xml:space="preserve"> </w:t>
+            </w:r>
+            <w:r>
+              <w:t xml:space="preserve">(browser-automation adapter tracked HCA-QA-UI-001)</w:t>
             </w:r>
           </w:p>
         </w:tc>
@@ -3495,165 +4967,59 @@
               <w:pStyle w:val="Compact"/>
             </w:pPr>
             <w:r>
-              <w:t xml:space="preserve">Projects served read-write; Explorer defaults to</w:t>
-            </w:r>
-            <w:r>
-              <w:t xml:space="preserve"> </w:t>
-            </w:r>
-            <w:r>
-              <w:rPr>
-                <w:rStyle w:val="VerbatimChar"/>
-              </w:rPr>
-              <w:t xml:space="preserve">$PROJECTS_ROOT</w:t>
-            </w:r>
-            <w:r>
-              <w:t xml:space="preserve"> </w:t>
-            </w:r>
-            <w:r>
-              <w:t xml:space="preserve">(convenience view, NOT a jail)</w:t>
-            </w:r>
-          </w:p>
-        </w:tc>
-        <w:tc>
-          <w:tcPr/>
-          <w:p>
-            <w:pPr>
-              <w:pStyle w:val="Compact"/>
-            </w:pPr>
-            <w:r>
-              <w:t xml:space="preserve">editor</w:t>
-            </w:r>
-          </w:p>
-        </w:tc>
-        <w:tc>
-          <w:tcPr/>
-          <w:p>
-            <w:pPr>
-              <w:pStyle w:val="Compact"/>
-            </w:pPr>
-            <w:r>
-              <w:rPr>
-                <w:rStyle w:val="VerbatimChar"/>
-              </w:rPr>
-              <w:t xml:space="preserve">deploy/systemd/helix-code-server.service</w:t>
-            </w:r>
-            <w:r>
-              <w:t xml:space="preserve">,</w:t>
-            </w:r>
-            <w:r>
-              <w:t xml:space="preserve"> </w:t>
-            </w:r>
-            <w:r>
-              <w:rPr>
-                <w:rStyle w:val="VerbatimChar"/>
-              </w:rPr>
-              <w:t xml:space="preserve">deploy/.env</w:t>
-            </w:r>
-            <w:r>
-              <w:t xml:space="preserve"> </w:t>
-            </w:r>
-            <w:r>
-              <w:rPr>
-                <w:rStyle w:val="VerbatimChar"/>
-              </w:rPr>
-              <w:t xml:space="preserve">PROJECTS_ROOT</w:t>
-            </w:r>
-          </w:p>
-        </w:tc>
-        <w:tc>
-          <w:tcPr/>
-          <w:p>
-            <w:pPr>
-              <w:pStyle w:val="Compact"/>
-            </w:pPr>
-            <w:r>
-              <w:t xml:space="preserve">workspace/ExecStart</w:t>
-            </w:r>
-          </w:p>
-        </w:tc>
-        <w:tc>
-          <w:tcPr/>
-          <w:p>
-            <w:pPr>
-              <w:pStyle w:val="Compact"/>
-            </w:pPr>
-            <w:r>
-              <w:t xml:space="preserve">yes</w:t>
-            </w:r>
-          </w:p>
-        </w:tc>
-        <w:tc>
-          <w:tcPr/>
-          <w:p>
-            <w:pPr>
-              <w:pStyle w:val="Compact"/>
-            </w:pPr>
-            <w:r>
-              <w:t xml:space="preserve">challenges_auth (CH5), helixqa_auth</w:t>
-            </w:r>
-          </w:p>
-        </w:tc>
-        <w:tc>
-          <w:tcPr/>
-          <w:p>
-            <w:pPr>
-              <w:pStyle w:val="Compact"/>
-            </w:pPr>
-            <w:r>
-              <w:t xml:space="preserve">PASS ·</w:t>
-            </w:r>
-            <w:r>
-              <w:t xml:space="preserve"> </w:t>
-            </w:r>
-            <w:r>
-              <w:rPr>
-                <w:rStyle w:val="VerbatimChar"/>
-              </w:rPr>
-              <w:t xml:space="preserve">qa-results/tests/challenges_auth/20260701T151325Z-3188693/ch5_projects_root_default.txt</w:t>
-            </w:r>
-          </w:p>
-        </w:tc>
-        <w:tc>
-          <w:tcPr/>
-          <w:p>
-            <w:pPr>
-              <w:pStyle w:val="Compact"/>
-            </w:pPr>
-            <w:r>
-              <w:t xml:space="preserve">PENDING</w:t>
-            </w:r>
-          </w:p>
-        </w:tc>
-      </w:tr>
-      <w:tr>
-        <w:tc>
-          <w:tcPr/>
-          <w:p>
-            <w:pPr>
-              <w:pStyle w:val="Compact"/>
-            </w:pPr>
-            <w:r>
-              <w:t xml:space="preserve">code-server</w:t>
-            </w:r>
-          </w:p>
-        </w:tc>
-        <w:tc>
-          <w:tcPr/>
-          <w:p>
-            <w:pPr>
-              <w:pStyle w:val="Compact"/>
-            </w:pPr>
-            <w:r>
-              <w:t xml:space="preserve">SSH-key git from the integrated terminal (host</w:t>
-            </w:r>
-            <w:r>
-              <w:t xml:space="preserve"> </w:t>
-            </w:r>
-            <w:r>
-              <w:rPr>
-                <w:rStyle w:val="VerbatimChar"/>
-              </w:rPr>
-              <w:t xml:space="preserve">~/.ssh</w:t>
+              <w:t xml:space="preserve">UI-driven marketplace journey (open Extensions view → search Open VSX → click real Install button, pixel+OCR)</w:t>
+            </w:r>
+          </w:p>
+        </w:tc>
+        <w:tc>
+          <w:tcPr/>
+          <w:p>
+            <w:pPr>
+              <w:pStyle w:val="Compact"/>
+            </w:pPr>
+            <w:r>
+              <w:t xml:space="preserve">editor/ui</w:t>
+            </w:r>
+          </w:p>
+        </w:tc>
+        <w:tc>
+          <w:tcPr/>
+          <w:p>
+            <w:pPr>
+              <w:pStyle w:val="Compact"/>
+            </w:pPr>
+            <w:r>
+              <w:rPr>
+                <w:rStyle w:val="VerbatimChar"/>
+              </w:rPr>
+              <w:t xml:space="preserve">tests/types/extensions_ui_auth.sh</w:t>
+            </w:r>
+            <w:r>
+              <w:t xml:space="preserve">, bank</w:t>
+            </w:r>
+            <w:r>
+              <w:t xml:space="preserve"> </w:t>
+            </w:r>
+            <w:r>
+              <w:rPr>
+                <w:rStyle w:val="VerbatimChar"/>
+              </w:rPr>
+              <w:t xml:space="preserve">tests/banks/helixcode-extensions-ui.yaml</w:t>
+            </w:r>
+            <w:r>
+              <w:t xml:space="preserve"> </w:t>
+            </w:r>
+            <w:r>
+              <w:t xml:space="preserve">(commit</w:t>
+            </w:r>
+            <w:r>
+              <w:t xml:space="preserve"> </w:t>
+            </w:r>
+            <w:r>
+              <w:rPr>
+                <w:rStyle w:val="VerbatimChar"/>
+              </w:rPr>
+              <w:t xml:space="preserve">8351e4c</w:t>
             </w:r>
             <w:r>
               <w:t xml:space="preserve">)</w:t>
@@ -3667,610 +5033,95 @@
               <w:pStyle w:val="Compact"/>
             </w:pPr>
             <w:r>
-              <w:t xml:space="preserve">editor/env</w:t>
-            </w:r>
-          </w:p>
-        </w:tc>
-        <w:tc>
-          <w:tcPr/>
-          <w:p>
-            <w:pPr>
-              <w:pStyle w:val="Compact"/>
-            </w:pPr>
-            <w:r>
-              <w:t xml:space="preserve">host-native as real user</w:t>
-            </w:r>
-          </w:p>
-        </w:tc>
-        <w:tc>
-          <w:tcPr/>
-          <w:p>
-            <w:pPr>
-              <w:pStyle w:val="Compact"/>
-            </w:pPr>
-            <w:r>
-              <w:t xml:space="preserve">login shell inherits</w:t>
-            </w:r>
-            <w:r>
-              <w:t xml:space="preserve"> </w:t>
-            </w:r>
-            <w:r>
-              <w:rPr>
-                <w:rStyle w:val="VerbatimChar"/>
-              </w:rPr>
-              <w:t xml:space="preserve">~/.ssh</w:t>
-            </w:r>
-          </w:p>
-        </w:tc>
-        <w:tc>
-          <w:tcPr/>
-          <w:p>
-            <w:pPr>
-              <w:pStyle w:val="Compact"/>
-            </w:pPr>
-            <w:r>
-              <w:t xml:space="preserve">yes —</w:t>
-            </w:r>
-            <w:r>
-              <w:t xml:space="preserve"> </w:t>
-            </w:r>
-            <w:r>
-              <w:rPr>
-                <w:rStyle w:val="VerbatimChar"/>
-              </w:rPr>
-              <w:t xml:space="preserve">git ls-remote</w:t>
-            </w:r>
-            <w:r>
-              <w:t xml:space="preserve"> </w:t>
-            </w:r>
-            <w:r>
-              <w:t xml:space="preserve">returned 5 refs</w:t>
-            </w:r>
-          </w:p>
-        </w:tc>
-        <w:tc>
-          <w:tcPr/>
-          <w:p>
-            <w:pPr>
-              <w:pStyle w:val="Compact"/>
-            </w:pPr>
-            <w:r>
-              <w:t xml:space="preserve">challenges_auth (CH3)</w:t>
-            </w:r>
-          </w:p>
-        </w:tc>
-        <w:tc>
-          <w:tcPr/>
-          <w:p>
-            <w:pPr>
-              <w:pStyle w:val="Compact"/>
-            </w:pPr>
-            <w:r>
-              <w:t xml:space="preserve">PASS ·</w:t>
-            </w:r>
-            <w:r>
-              <w:t xml:space="preserve"> </w:t>
-            </w:r>
-            <w:r>
-              <w:rPr>
-                <w:rStyle w:val="VerbatimChar"/>
-              </w:rPr>
-              <w:t xml:space="preserve">qa-results/tests/challenges_auth/20260701T151325Z-3188693/ch3_git_lsremote.txt</w:t>
-            </w:r>
-          </w:p>
-        </w:tc>
-        <w:tc>
-          <w:tcPr/>
-          <w:p>
-            <w:pPr>
-              <w:pStyle w:val="Compact"/>
-            </w:pPr>
-            <w:r>
-              <w:t xml:space="preserve">PENDING</w:t>
-            </w:r>
-          </w:p>
-        </w:tc>
-      </w:tr>
-      <w:tr>
-        <w:tc>
-          <w:tcPr/>
-          <w:p>
-            <w:pPr>
-              <w:pStyle w:val="Compact"/>
-            </w:pPr>
-            <w:r>
-              <w:t xml:space="preserve">code-server</w:t>
-            </w:r>
-          </w:p>
-        </w:tc>
-        <w:tc>
-          <w:tcPr/>
-          <w:p>
-            <w:pPr>
-              <w:pStyle w:val="Compact"/>
-            </w:pPr>
-            <w:r>
-              <w:rPr>
-                <w:rStyle w:val="VerbatimChar"/>
-              </w:rPr>
-              <w:t xml:space="preserve">.bashrc</w:t>
-            </w:r>
-            <w:r>
-              <w:t xml:space="preserve"> </w:t>
-            </w:r>
-            <w:r>
-              <w:t xml:space="preserve">/ profile sourced in fresh terminal</w:t>
-            </w:r>
-          </w:p>
-        </w:tc>
-        <w:tc>
-          <w:tcPr/>
-          <w:p>
-            <w:pPr>
-              <w:pStyle w:val="Compact"/>
-            </w:pPr>
-            <w:r>
-              <w:t xml:space="preserve">editor/env</w:t>
-            </w:r>
-          </w:p>
-        </w:tc>
-        <w:tc>
-          <w:tcPr/>
-          <w:p>
-            <w:pPr>
-              <w:pStyle w:val="Compact"/>
-            </w:pPr>
-            <w:r>
-              <w:t xml:space="preserve">host-native as real user</w:t>
-            </w:r>
-          </w:p>
-        </w:tc>
-        <w:tc>
-          <w:tcPr/>
-          <w:p>
-            <w:pPr>
-              <w:pStyle w:val="Compact"/>
-            </w:pPr>
-            <w:r>
-              <w:t xml:space="preserve">login shell (</w:t>
-            </w:r>
-            <w:r>
-              <w:rPr>
-                <w:rStyle w:val="VerbatimChar"/>
-              </w:rPr>
-              <w:t xml:space="preserve">bash -l</w:t>
-            </w:r>
-            <w:r>
-              <w:t xml:space="preserve">)</w:t>
-            </w:r>
-          </w:p>
-        </w:tc>
-        <w:tc>
-          <w:tcPr/>
-          <w:p>
-            <w:pPr>
-              <w:pStyle w:val="Compact"/>
-            </w:pPr>
-            <w:r>
-              <w:t xml:space="preserve">yes —</w:t>
-            </w:r>
-            <w:r>
-              <w:t xml:space="preserve"> </w:t>
-            </w:r>
-            <w:r>
-              <w:rPr>
-                <w:rStyle w:val="VerbatimChar"/>
-              </w:rPr>
-              <w:t xml:space="preserve">$OSH</w:t>
-            </w:r>
-            <w:r>
-              <w:t xml:space="preserve"> </w:t>
-            </w:r>
-            <w:r>
-              <w:t xml:space="preserve">export present</w:t>
-            </w:r>
-          </w:p>
-        </w:tc>
-        <w:tc>
-          <w:tcPr/>
-          <w:p>
-            <w:pPr>
-              <w:pStyle w:val="Compact"/>
-            </w:pPr>
-            <w:r>
-              <w:t xml:space="preserve">challenges_auth (CH4)</w:t>
-            </w:r>
-          </w:p>
-        </w:tc>
-        <w:tc>
-          <w:tcPr/>
-          <w:p>
-            <w:pPr>
-              <w:pStyle w:val="Compact"/>
-            </w:pPr>
-            <w:r>
-              <w:t xml:space="preserve">PASS ·</w:t>
-            </w:r>
-            <w:r>
-              <w:t xml:space="preserve"> </w:t>
-            </w:r>
-            <w:r>
-              <w:rPr>
-                <w:rStyle w:val="VerbatimChar"/>
-              </w:rPr>
-              <w:t xml:space="preserve">qa-results/tests/challenges_auth/20260701T151325Z-3188693/ch4_bashrc_exports.txt</w:t>
-            </w:r>
-          </w:p>
-        </w:tc>
-        <w:tc>
-          <w:tcPr/>
-          <w:p>
-            <w:pPr>
-              <w:pStyle w:val="Compact"/>
-            </w:pPr>
-            <w:r>
-              <w:t xml:space="preserve">PENDING</w:t>
-            </w:r>
-          </w:p>
-        </w:tc>
-      </w:tr>
-      <w:tr>
-        <w:tc>
-          <w:tcPr/>
-          <w:p>
-            <w:pPr>
-              <w:pStyle w:val="Compact"/>
-            </w:pPr>
-            <w:r>
-              <w:t xml:space="preserve">code-server</w:t>
-            </w:r>
-          </w:p>
-        </w:tc>
-        <w:tc>
-          <w:tcPr/>
-          <w:p>
-            <w:pPr>
-              <w:pStyle w:val="Compact"/>
-            </w:pPr>
-            <w:r>
-              <w:t xml:space="preserve">Extension (plugin) install + use from Open VSX marketplace</w:t>
-            </w:r>
-          </w:p>
-        </w:tc>
-        <w:tc>
-          <w:tcPr/>
-          <w:p>
-            <w:pPr>
-              <w:pStyle w:val="Compact"/>
-            </w:pPr>
-            <w:r>
-              <w:t xml:space="preserve">editor/extensions</w:t>
-            </w:r>
-          </w:p>
-        </w:tc>
-        <w:tc>
-          <w:tcPr/>
-          <w:p>
-            <w:pPr>
-              <w:pStyle w:val="Compact"/>
-            </w:pPr>
-            <w:r>
-              <w:rPr>
-                <w:rStyle w:val="VerbatimChar"/>
-              </w:rPr>
-              <w:t xml:space="preserve">tests/types/extensions_auth.sh</w:t>
-            </w:r>
-            <w:r>
-              <w:t xml:space="preserve">, bank</w:t>
-            </w:r>
-            <w:r>
-              <w:t xml:space="preserve"> </w:t>
-            </w:r>
-            <w:r>
-              <w:rPr>
-                <w:rStyle w:val="VerbatimChar"/>
-              </w:rPr>
-              <w:t xml:space="preserve">tests/banks/helixcode-extensions.yaml</w:t>
-            </w:r>
-          </w:p>
-        </w:tc>
-        <w:tc>
-          <w:tcPr/>
-          <w:p>
-            <w:pPr>
-              <w:pStyle w:val="Compact"/>
-            </w:pPr>
-            <w:r>
-              <w:t xml:space="preserve">code-server extension host; throwaway</w:t>
-            </w:r>
-            <w:r>
-              <w:t xml:space="preserve"> </w:t>
-            </w:r>
-            <w:r>
-              <w:rPr>
-                <w:rStyle w:val="VerbatimChar"/>
-              </w:rPr>
-              <w:t xml:space="preserve">--extensions-dir</w:t>
-            </w:r>
-            <w:r>
-              <w:t xml:space="preserve"> </w:t>
-            </w:r>
-            <w:r>
-              <w:t xml:space="preserve">(live dir untouched)</w:t>
-            </w:r>
-          </w:p>
-        </w:tc>
-        <w:tc>
-          <w:tcPr/>
-          <w:p>
-            <w:pPr>
-              <w:pStyle w:val="Compact"/>
-            </w:pPr>
-            <w:r>
-              <w:t xml:space="preserve">yes — live install (</w:t>
-            </w:r>
-            <w:r>
-              <w:rPr>
-                <w:rStyle w:val="VerbatimChar"/>
-              </w:rPr>
-              <w:t xml:space="preserve">redhat/vscode-yaml@1.24.…</w:t>
-            </w:r>
-            <w:r>
-              <w:t xml:space="preserve">), manifest + extension-host load</w:t>
-            </w:r>
-          </w:p>
-        </w:tc>
-        <w:tc>
-          <w:tcPr/>
-          <w:p>
-            <w:pPr>
-              <w:pStyle w:val="Compact"/>
-            </w:pPr>
-            <w:r>
-              <w:t xml:space="preserve">e2e/full-automation, Challenges</w:t>
-            </w:r>
-          </w:p>
-        </w:tc>
-        <w:tc>
-          <w:tcPr/>
-          <w:p>
-            <w:pPr>
-              <w:pStyle w:val="Compact"/>
-            </w:pPr>
-            <w:r>
-              <w:t xml:space="preserve">PASS · 5/5 checks captured</w:t>
-            </w:r>
-            <w:r>
-              <w:t xml:space="preserve"> </w:t>
-            </w:r>
-            <w:r>
-              <w:rPr>
-                <w:rStyle w:val="VerbatimChar"/>
-              </w:rPr>
-              <w:t xml:space="preserve">qa-results/tests/extensions_auth/20260701T162817Z-4080597</w:t>
-            </w:r>
-            <w:r>
-              <w:t xml:space="preserve"> </w:t>
-            </w:r>
-            <w:r>
-              <w:t xml:space="preserve">(x1 Open VSX 200 → x4 cleanup)</w:t>
-            </w:r>
-          </w:p>
-        </w:tc>
-        <w:tc>
-          <w:tcPr/>
-          <w:p>
-            <w:pPr>
-              <w:pStyle w:val="Compact"/>
-            </w:pPr>
-            <w:r>
-              <w:t xml:space="preserve">PENDING</w:t>
-            </w:r>
-          </w:p>
-        </w:tc>
-      </w:tr>
-      <w:tr>
-        <w:tc>
-          <w:tcPr/>
-          <w:p>
-            <w:pPr>
-              <w:pStyle w:val="Compact"/>
-            </w:pPr>
-            <w:r>
-              <w:t xml:space="preserve">code-server</w:t>
-            </w:r>
-          </w:p>
-        </w:tc>
-        <w:tc>
-          <w:tcPr/>
-          <w:p>
-            <w:pPr>
-              <w:pStyle w:val="Compact"/>
-            </w:pPr>
-            <w:r>
-              <w:t xml:space="preserve">In-browser editing (type/save via UI, file tree, command palette)</w:t>
-            </w:r>
-          </w:p>
-        </w:tc>
-        <w:tc>
-          <w:tcPr/>
-          <w:p>
-            <w:pPr>
-              <w:pStyle w:val="Compact"/>
-            </w:pPr>
-            <w:r>
-              <w:t xml:space="preserve">editor/ui</w:t>
-            </w:r>
-          </w:p>
-        </w:tc>
-        <w:tc>
-          <w:tcPr/>
-          <w:p>
-            <w:pPr>
-              <w:pStyle w:val="Compact"/>
-            </w:pPr>
-            <w:r>
-              <w:t xml:space="preserve">code-server workbench</w:t>
-            </w:r>
-          </w:p>
-        </w:tc>
-        <w:tc>
-          <w:tcPr/>
-          <w:p>
-            <w:pPr>
-              <w:pStyle w:val="Compact"/>
-            </w:pPr>
-            <w:r>
-              <w:t xml:space="preserve">browser websocket</w:t>
-            </w:r>
-          </w:p>
-        </w:tc>
-        <w:tc>
-          <w:tcPr/>
-          <w:p>
-            <w:pPr>
-              <w:pStyle w:val="Compact"/>
-            </w:pPr>
-            <w:r>
-              <w:t xml:space="preserve">—</w:t>
-            </w:r>
-          </w:p>
-        </w:tc>
-        <w:tc>
-          <w:tcPr/>
-          <w:p>
-            <w:pPr>
-              <w:pStyle w:val="Compact"/>
-            </w:pPr>
-            <w:r>
-              <w:t xml:space="preserve">helixqa_auth (HCA-QA-UI-001)</w:t>
-            </w:r>
-          </w:p>
-        </w:tc>
-        <w:tc>
-          <w:tcPr/>
-          <w:p>
-            <w:pPr>
-              <w:pStyle w:val="Compact"/>
-            </w:pPr>
-            <w:r>
-              <w:t xml:space="preserve">OPERATOR-ATTENDED · SKIP</w:t>
-            </w:r>
-            <w:r>
-              <w:t xml:space="preserve"> </w:t>
-            </w:r>
-            <w:r>
-              <w:rPr>
-                <w:rStyle w:val="VerbatimChar"/>
-              </w:rPr>
-              <w:t xml:space="preserve">operator_attended</w:t>
-            </w:r>
-            <w:r>
-              <w:t xml:space="preserve"> </w:t>
-            </w:r>
-            <w:r>
-              <w:t xml:space="preserve">(browser-automation adapter tracked HCA-QA-UI-001)</w:t>
-            </w:r>
-          </w:p>
-        </w:tc>
-        <w:tc>
-          <w:tcPr/>
-          <w:p>
-            <w:pPr>
-              <w:pStyle w:val="Compact"/>
-            </w:pPr>
-            <w:r>
-              <w:t xml:space="preserve">PENDING</w:t>
-            </w:r>
-          </w:p>
-        </w:tc>
-      </w:tr>
-      <w:tr>
-        <w:tc>
-          <w:tcPr/>
-          <w:p>
-            <w:pPr>
-              <w:pStyle w:val="Compact"/>
-            </w:pPr>
-            <w:r>
-              <w:t xml:space="preserve">code-server</w:t>
-            </w:r>
-          </w:p>
-        </w:tc>
-        <w:tc>
-          <w:tcPr/>
-          <w:p>
-            <w:pPr>
-              <w:pStyle w:val="Compact"/>
-            </w:pPr>
-            <w:r>
-              <w:t xml:space="preserve">UI-driven marketplace test (browse → install → use through the editor UI)</w:t>
-            </w:r>
-          </w:p>
-        </w:tc>
-        <w:tc>
-          <w:tcPr/>
-          <w:p>
-            <w:pPr>
-              <w:pStyle w:val="Compact"/>
-            </w:pPr>
-            <w:r>
-              <w:t xml:space="preserve">editor/ui</w:t>
-            </w:r>
-          </w:p>
-        </w:tc>
-        <w:tc>
-          <w:tcPr/>
-          <w:p>
-            <w:pPr>
-              <w:pStyle w:val="Compact"/>
-            </w:pPr>
-            <w:r>
-              <w:t xml:space="preserve">(planned driver)</w:t>
-            </w:r>
-          </w:p>
-        </w:tc>
-        <w:tc>
-          <w:tcPr/>
-          <w:p>
-            <w:pPr>
-              <w:pStyle w:val="Compact"/>
-            </w:pPr>
-            <w:r>
-              <w:t xml:space="preserve">browser automation</w:t>
-            </w:r>
-          </w:p>
-        </w:tc>
-        <w:tc>
-          <w:tcPr/>
-          <w:p>
-            <w:pPr>
-              <w:pStyle w:val="Compact"/>
-            </w:pPr>
-            <w:r>
-              <w:t xml:space="preserve">—</w:t>
-            </w:r>
-          </w:p>
-        </w:tc>
-        <w:tc>
-          <w:tcPr/>
-          <w:p>
-            <w:pPr>
-              <w:pStyle w:val="Compact"/>
-            </w:pPr>
-            <w:r>
-              <w:t xml:space="preserve">(UI-driven test in progress)</w:t>
-            </w:r>
-          </w:p>
-        </w:tc>
-        <w:tc>
-          <w:tcPr/>
-          <w:p>
-            <w:pPr>
-              <w:pStyle w:val="Compact"/>
-            </w:pPr>
-            <w:r>
-              <w:t xml:space="preserve">PENDING · subagent in flight; today's coverage is the HTTP/CLI-driven</w:t>
+              <w:t xml:space="preserve">headless Chromium driving the real editor UI</w:t>
+            </w:r>
+          </w:p>
+        </w:tc>
+        <w:tc>
+          <w:tcPr/>
+          <w:p>
+            <w:pPr>
+              <w:pStyle w:val="Compact"/>
+            </w:pPr>
+            <w:r>
+              <w:t xml:space="preserve">yes — browse→search→Install-click driven through the editor's own UI, read from rendered pixels</w:t>
+            </w:r>
+          </w:p>
+        </w:tc>
+        <w:tc>
+          <w:tcPr/>
+          <w:p>
+            <w:pPr>
+              <w:pStyle w:val="Compact"/>
+            </w:pPr>
+            <w:r>
+              <w:t xml:space="preserve">full-automation (UI-driven §11.4.48), Challenges</w:t>
+            </w:r>
+          </w:p>
+        </w:tc>
+        <w:tc>
+          <w:tcPr/>
+          <w:p>
+            <w:pPr>
+              <w:pStyle w:val="Compact"/>
+            </w:pPr>
+            <w:r>
+              <w:t xml:space="preserve">PASS · Extensions view + Open VSX search rendered result (</w:t>
+            </w:r>
+            <w:r>
+              <w:rPr>
+                <w:rStyle w:val="VerbatimChar"/>
+              </w:rPr>
+              <w:t xml:space="preserve">u3_search_results.png</w:t>
+            </w:r>
+            <w:r>
+              <w:t xml:space="preserve">) + real Install button located+clicked</w:t>
+            </w:r>
+            <w:r>
+              <w:t xml:space="preserve"> </w:t>
+            </w:r>
+            <w:r>
+              <w:rPr>
+                <w:rStyle w:val="VerbatimChar"/>
+              </w:rPr>
+              <w:t xml:space="preserve">qa-results/tests/extensions_ui_auth/20260701T171228Z-232181</w:t>
+            </w:r>
+            <w:r>
+              <w:t xml:space="preserve"> </w:t>
+            </w:r>
+            <w:r>
+              <w:t xml:space="preserve">(5/1).</w:t>
+            </w:r>
+            <w:r>
+              <w:t xml:space="preserve"> </w:t>
+            </w:r>
+            <w:r>
+              <w:rPr>
+                <w:b/>
+                <w:bCs/>
+              </w:rPr>
+              <w:t xml:space="preserve">Honest operator_attended sub-note (§11.4.52):</w:t>
+            </w:r>
+            <w:r>
+              <w:t xml:space="preserve"> </w:t>
+            </w:r>
+            <w:r>
+              <w:t xml:space="preserve">headless cross-origin Open VSX install-completion query is</w:t>
+            </w:r>
+            <w:r>
+              <w:t xml:space="preserve"> </w:t>
+            </w:r>
+            <w:r>
+              <w:rPr>
+                <w:rStyle w:val="VerbatimChar"/>
+              </w:rPr>
+              <w:t xml:space="preserve">net::ERR_ABORTED</w:t>
+            </w:r>
+            <w:r>
+              <w:t xml:space="preserve"> </w:t>
+            </w:r>
+            <w:r>
+              <w:t xml:space="preserve">and can hang → install-completion is an operator_attended SKIP; the autonomous on-disk+host-load proof for the same ext+marketplace is the CLI sibling</w:t>
             </w:r>
             <w:r>
               <w:t xml:space="preserve"> </w:t>
@@ -5731,6 +6582,171 @@
         <w:t xml:space="preserve">).</w:t>
       </w:r>
     </w:p>
+    <w:p>
+      <w:pPr>
+        <w:pStyle w:val="Compact"/>
+        <w:numPr>
+          <w:ilvl w:val="0"/>
+          <w:numId w:val="1002"/>
+        </w:numPr>
+      </w:pPr>
+      <w:r>
+        <w:rPr>
+          <w:b/>
+          <w:bCs/>
+        </w:rPr>
+        <w:t xml:space="preserve">Post-</w:t>
+      </w:r>
+      <w:r>
+        <w:rPr>
+          <w:rStyle w:val="VerbatimChar"/>
+          <w:b/>
+          <w:bCs/>
+        </w:rPr>
+        <w:t xml:space="preserve">0.0.3</w:t>
+      </w:r>
+      <w:r>
+        <w:rPr>
+          <w:b/>
+          <w:bCs/>
+        </w:rPr>
+        <w:t xml:space="preserve"> </w:t>
+      </w:r>
+      <w:r>
+        <w:rPr>
+          <w:b/>
+          <w:bCs/>
+        </w:rPr>
+        <w:t xml:space="preserve">suites (registered in</w:t>
+      </w:r>
+      <w:r>
+        <w:rPr>
+          <w:b/>
+          <w:bCs/>
+        </w:rPr>
+        <w:t xml:space="preserve"> </w:t>
+      </w:r>
+      <w:r>
+        <w:rPr>
+          <w:rStyle w:val="VerbatimChar"/>
+          <w:b/>
+          <w:bCs/>
+        </w:rPr>
+        <w:t xml:space="preserve">run_all_types.sh</w:t>
+      </w:r>
+      <w:r>
+        <w:rPr>
+          <w:b/>
+          <w:bCs/>
+        </w:rPr>
+        <w:t xml:space="preserve">, separate captured runs):</w:t>
+      </w:r>
+      <w:r>
+        <w:t xml:space="preserve"> </w:t>
+      </w:r>
+      <w:r>
+        <w:rPr>
+          <w:rStyle w:val="VerbatimChar"/>
+        </w:rPr>
+        <w:t xml:space="preserve">login_ui_auth</w:t>
+      </w:r>
+      <w:r>
+        <w:t xml:space="preserve"> </w:t>
+      </w:r>
+      <w:r>
+        <w:t xml:space="preserve">LIVE 3/3 (L2 node 8/8 + L3 CDP pixel proof</w:t>
+      </w:r>
+      <w:r>
+        <w:t xml:space="preserve"> </w:t>
+      </w:r>
+      <w:r>
+        <w:rPr>
+          <w:rStyle w:val="VerbatimChar"/>
+        </w:rPr>
+        <w:t xml:space="preserve">ok:true</w:t>
+      </w:r>
+      <w:r>
+        <w:t xml:space="preserve">) ·</w:t>
+      </w:r>
+      <w:r>
+        <w:t xml:space="preserve"> </w:t>
+      </w:r>
+      <w:r>
+        <w:rPr>
+          <w:rStyle w:val="VerbatimChar"/>
+        </w:rPr>
+        <w:t xml:space="preserve">theme_default_auth</w:t>
+      </w:r>
+      <w:r>
+        <w:t xml:space="preserve"> </w:t>
+      </w:r>
+      <w:r>
+        <w:t xml:space="preserve">3/3 config ·</w:t>
+      </w:r>
+      <w:r>
+        <w:t xml:space="preserve"> </w:t>
+      </w:r>
+      <w:r>
+        <w:rPr>
+          <w:rStyle w:val="VerbatimChar"/>
+        </w:rPr>
+        <w:t xml:space="preserve">theme_visual_auth</w:t>
+      </w:r>
+      <w:r>
+        <w:t xml:space="preserve"> </w:t>
+      </w:r>
+      <w:r>
+        <w:t xml:space="preserve">§11.4.170 rendered-pixel proof</w:t>
+      </w:r>
+      <w:r>
+        <w:t xml:space="preserve"> </w:t>
+      </w:r>
+      <w:r>
+        <w:t xml:space="preserve">(dark meanLum 44.3 vs light control 228.5) ·</w:t>
+      </w:r>
+      <w:r>
+        <w:t xml:space="preserve"> </w:t>
+      </w:r>
+      <w:r>
+        <w:rPr>
+          <w:rStyle w:val="VerbatimChar"/>
+        </w:rPr>
+        <w:t xml:space="preserve">extensions_popular_auth</w:t>
+      </w:r>
+      <w:r>
+        <w:t xml:space="preserve"> </w:t>
+      </w:r>
+      <w:r>
+        <w:t xml:space="preserve">install proven</w:t>
+      </w:r>
+      <w:r>
+        <w:t xml:space="preserve"> </w:t>
+      </w:r>
+      <w:r>
+        <w:t xml:space="preserve">live (4/5 + direct 8-ext probe; network-gated) ·</w:t>
+      </w:r>
+      <w:r>
+        <w:t xml:space="preserve"> </w:t>
+      </w:r>
+      <w:r>
+        <w:rPr>
+          <w:rStyle w:val="VerbatimChar"/>
+        </w:rPr>
+        <w:t xml:space="preserve">extensions_ui_auth</w:t>
+      </w:r>
+      <w:r>
+        <w:t xml:space="preserve"> </w:t>
+      </w:r>
+      <w:r>
+        <w:t xml:space="preserve">5/1 UI-driven</w:t>
+      </w:r>
+      <w:r>
+        <w:t xml:space="preserve"> </w:t>
+      </w:r>
+      <w:r>
+        <w:t xml:space="preserve">(browse→search→Install-click; operator_attended install-completion).</w:t>
+      </w:r>
+    </w:p>
     <w:bookmarkEnd w:id="14"/>
     <w:bookmarkStart w:id="15" w:name="honest-boundaries-1146"/>
     <w:p>
@@ -6106,68 +7122,355 @@
           <w:b/>
           <w:bCs/>
         </w:rPr>
-        <w:t xml:space="preserve">In-flight (subagents, NOT done):</w:t>
-      </w:r>
-      <w:r>
-        <w:t xml:space="preserve"> </w:t>
-      </w:r>
-      <w:r>
-        <w:t xml:space="preserve">the login-form clipboard copy/paste buttons</w:t>
-      </w:r>
-      <w:r>
-        <w:t xml:space="preserve"> </w:t>
-      </w:r>
-      <w:r>
-        <w:t xml:space="preserve">(</w:t>
-      </w:r>
-      <w:r>
-        <w:rPr>
-          <w:rStyle w:val="VerbatimChar"/>
-        </w:rPr>
-        <w:t xml:space="preserve">login_enhance.js</w:t>
-      </w:r>
-      <w:r>
-        <w:t xml:space="preserve"> </w:t>
-      </w:r>
-      <w:r>
-        <w:t xml:space="preserve">— source landed, unvalidated) and the UI-driven marketplace</w:t>
-      </w:r>
-      <w:r>
-        <w:t xml:space="preserve"> </w:t>
-      </w:r>
-      <w:r>
-        <w:t xml:space="preserve">test are</w:t>
-      </w:r>
-      <w:r>
-        <w:t xml:space="preserve"> </w:t>
-      </w:r>
-      <w:r>
-        <w:rPr>
+        <w:t xml:space="preserve">Post-</w:t>
+      </w:r>
+      <w:r>
+        <w:rPr>
+          <w:rStyle w:val="VerbatimChar"/>
           <w:b/>
           <w:bCs/>
         </w:rPr>
-        <w:t xml:space="preserve">PENDING</w:t>
-      </w:r>
-      <w:r>
-        <w:t xml:space="preserve"> </w:t>
-      </w:r>
-      <w:r>
-        <w:t xml:space="preserve">— the current extension coverage is the HTTP/CLI-driven</w:t>
-      </w:r>
-      <w:r>
-        <w:t xml:space="preserve"> </w:t>
-      </w:r>
-      <w:r>
-        <w:rPr>
-          <w:rStyle w:val="VerbatimChar"/>
-        </w:rPr>
-        <w:t xml:space="preserve">extensions_auth</w:t>
-      </w:r>
-      <w:r>
-        <w:t xml:space="preserve"> </w:t>
-      </w:r>
-      <w:r>
-        <w:t xml:space="preserve">suite (live 5/5).</w:t>
+        <w:t xml:space="preserve">0.0.3</w:t>
+      </w:r>
+      <w:r>
+        <w:rPr>
+          <w:b/>
+          <w:bCs/>
+        </w:rPr>
+        <w:t xml:space="preserve"> </w:t>
+      </w:r>
+      <w:r>
+        <w:rPr>
+          <w:b/>
+          <w:bCs/>
+        </w:rPr>
+        <w:t xml:space="preserve">additions now PASS (were in-flight/PENDING at Revision 2):</w:t>
+      </w:r>
+      <w:r>
+        <w:t xml:space="preserve"> </w:t>
+      </w:r>
+      <w:r>
+        <w:t xml:space="preserve">the</w:t>
+      </w:r>
+      <w:r>
+        <w:t xml:space="preserve"> </w:t>
+      </w:r>
+      <w:r>
+        <w:t xml:space="preserve">login-form clipboard copy/paste buttons (</w:t>
+      </w:r>
+      <w:r>
+        <w:rPr>
+          <w:rStyle w:val="VerbatimChar"/>
+        </w:rPr>
+        <w:t xml:space="preserve">login_enhance.js</w:t>
+      </w:r>
+      <w:r>
+        <w:t xml:space="preserve">, commit</w:t>
+      </w:r>
+      <w:r>
+        <w:t xml:space="preserve"> </w:t>
+      </w:r>
+      <w:r>
+        <w:rPr>
+          <w:rStyle w:val="VerbatimChar"/>
+        </w:rPr>
+        <w:t xml:space="preserve">8351e4c</w:t>
+      </w:r>
+      <w:r>
+        <w:t xml:space="preserve"> </w:t>
+      </w:r>
+      <w:r>
+        <w:t xml:space="preserve">— LIVE</w:t>
+      </w:r>
+      <w:r>
+        <w:t xml:space="preserve"> </w:t>
+      </w:r>
+      <w:r>
+        <w:t xml:space="preserve">3/3 incl §11.4.170 CDP pixel proof), the VS Code Dark default theme (</w:t>
+      </w:r>
+      <w:r>
+        <w:rPr>
+          <w:rStyle w:val="VerbatimChar"/>
+        </w:rPr>
+        <w:t xml:space="preserve">97a8c69</w:t>
+      </w:r>
+      <w:r>
+        <w:t xml:space="preserve"> </w:t>
+      </w:r>
+      <w:r>
+        <w:t xml:space="preserve">— config</w:t>
+      </w:r>
+      <w:r>
+        <w:t xml:space="preserve"> </w:t>
+      </w:r>
+      <w:r>
+        <w:t xml:space="preserve">3/3 + rendered-pixel proof), the popular-extensions matrix (</w:t>
+      </w:r>
+      <w:r>
+        <w:rPr>
+          <w:rStyle w:val="VerbatimChar"/>
+        </w:rPr>
+        <w:t xml:space="preserve">97a8c69</w:t>
+      </w:r>
+      <w:r>
+        <w:t xml:space="preserve">), the UI-driven</w:t>
+      </w:r>
+      <w:r>
+        <w:t xml:space="preserve"> </w:t>
+      </w:r>
+      <w:r>
+        <w:t xml:space="preserve">marketplace journey (</w:t>
+      </w:r>
+      <w:r>
+        <w:rPr>
+          <w:rStyle w:val="VerbatimChar"/>
+        </w:rPr>
+        <w:t xml:space="preserve">8351e4c</w:t>
+      </w:r>
+      <w:r>
+        <w:t xml:space="preserve"> </w:t>
+      </w:r>
+      <w:r>
+        <w:t xml:space="preserve">— browse→search→Install-click, operator_attended on</w:t>
+      </w:r>
+      <w:r>
+        <w:t xml:space="preserve"> </w:t>
+      </w:r>
+      <w:r>
+        <w:t xml:space="preserve">install-completion), and the rootless-Quadlet edge (now LIVE,</w:t>
+      </w:r>
+      <w:r>
+        <w:t xml:space="preserve"> </w:t>
+      </w:r>
+      <w:r>
+        <w:rPr>
+          <w:rStyle w:val="VerbatimChar"/>
+        </w:rPr>
+        <w:t xml:space="preserve">active (running)</w:t>
+      </w:r>
+      <w:r>
+        <w:t xml:space="preserve">).</w:t>
+      </w:r>
+    </w:p>
+    <w:p>
+      <w:pPr>
+        <w:pStyle w:val="Compact"/>
+        <w:numPr>
+          <w:ilvl w:val="0"/>
+          <w:numId w:val="1003"/>
+        </w:numPr>
+      </w:pPr>
+      <w:r>
+        <w:rPr>
+          <w:b/>
+          <w:bCs/>
+        </w:rPr>
+        <w:t xml:space="preserve">CDP-harness honesty (§11.4.6):</w:t>
+      </w:r>
+      <w:r>
+        <w:t xml:space="preserve"> </w:t>
+      </w:r>
+      <w:r>
+        <w:t xml:space="preserve">the §11.4.170 host-rendered pixel proofs for the</w:t>
+      </w:r>
+      <w:r>
+        <w:t xml:space="preserve"> </w:t>
+      </w:r>
+      <w:r>
+        <w:t xml:space="preserve">login buttons and the dark theme are genuine but were captured in the runs cited in</w:t>
+      </w:r>
+      <w:r>
+        <w:t xml:space="preserve"> </w:t>
+      </w:r>
+      <w:r>
+        <w:t xml:space="preserve">each row; the</w:t>
+      </w:r>
+      <w:r>
+        <w:t xml:space="preserve"> </w:t>
+      </w:r>
+      <w:r>
+        <w:rPr>
+          <w:b/>
+          <w:bCs/>
+        </w:rPr>
+        <w:t xml:space="preserve">latest</w:t>
+      </w:r>
+      <w:r>
+        <w:t xml:space="preserve"> </w:t>
+      </w:r>
+      <w:r>
+        <w:rPr>
+          <w:rStyle w:val="VerbatimChar"/>
+        </w:rPr>
+        <w:t xml:space="preserve">login_ui_auth</w:t>
+      </w:r>
+      <w:r>
+        <w:t xml:space="preserve"> </w:t>
+      </w:r>
+      <w:r>
+        <w:t xml:space="preserve">L3 and</w:t>
+      </w:r>
+      <w:r>
+        <w:t xml:space="preserve"> </w:t>
+      </w:r>
+      <w:r>
+        <w:rPr>
+          <w:rStyle w:val="VerbatimChar"/>
+        </w:rPr>
+        <w:t xml:space="preserve">theme_visual_auth</w:t>
+      </w:r>
+      <w:r>
+        <w:t xml:space="preserve"> </w:t>
+      </w:r>
+      <w:r>
+        <w:t xml:space="preserve">runs honestly</w:t>
+      </w:r>
+      <w:r>
+        <w:t xml:space="preserve"> </w:t>
+      </w:r>
+      <w:r>
+        <w:rPr>
+          <w:b/>
+          <w:bCs/>
+        </w:rPr>
+        <w:t xml:space="preserve">SKIPPED</w:t>
+      </w:r>
+      <w:r>
+        <w:t xml:space="preserve"> </w:t>
+      </w:r>
+      <w:r>
+        <w:t xml:space="preserve">(Chromium</w:t>
+      </w:r>
+      <w:r>
+        <w:t xml:space="preserve"> </w:t>
+      </w:r>
+      <w:r>
+        <w:rPr>
+          <w:rStyle w:val="VerbatimChar"/>
+        </w:rPr>
+        <w:t xml:space="preserve">Page.captureScreenshot</w:t>
+      </w:r>
+      <w:r>
+        <w:t xml:space="preserve"> </w:t>
+      </w:r>
+      <w:r>
+        <w:t xml:space="preserve">timeout / workbench-never-rendered under</w:t>
+      </w:r>
+      <w:r>
+        <w:t xml:space="preserve"> </w:t>
+      </w:r>
+      <w:r>
+        <w:t xml:space="preserve">the quiet matrix) — a skipped CDP run is never counted as the pixel-proof PASS, so the</w:t>
+      </w:r>
+      <w:r>
+        <w:t xml:space="preserve"> </w:t>
+      </w:r>
+      <w:r>
+        <w:t xml:space="preserve">ledger cites the run where the driver reported</w:t>
+      </w:r>
+      <w:r>
+        <w:t xml:space="preserve"> </w:t>
+      </w:r>
+      <w:r>
+        <w:rPr>
+          <w:rStyle w:val="VerbatimChar"/>
+        </w:rPr>
+        <w:t xml:space="preserve">ok:true</w:t>
+      </w:r>
+      <w:r>
+        <w:t xml:space="preserve"> </w:t>
+      </w:r>
+      <w:r>
+        <w:t xml:space="preserve">/ rc=0.</w:t>
+      </w:r>
+    </w:p>
+    <w:p>
+      <w:pPr>
+        <w:pStyle w:val="Compact"/>
+        <w:numPr>
+          <w:ilvl w:val="0"/>
+          <w:numId w:val="1003"/>
+        </w:numPr>
+      </w:pPr>
+      <w:r>
+        <w:rPr>
+          <w:rStyle w:val="VerbatimChar"/>
+          <w:b/>
+          <w:bCs/>
+        </w:rPr>
+        <w:t xml:space="preserve">extensions_popular_auth</w:t>
+      </w:r>
+      <w:r>
+        <w:rPr>
+          <w:b/>
+          <w:bCs/>
+        </w:rPr>
+        <w:t xml:space="preserve"> </w:t>
+      </w:r>
+      <w:r>
+        <w:rPr>
+          <w:b/>
+          <w:bCs/>
+        </w:rPr>
+        <w:t xml:space="preserve">is network-gated (§11.4.6):</w:t>
+      </w:r>
+      <w:r>
+        <w:t xml:space="preserve"> </w:t>
+      </w:r>
+      <w:r>
+        <w:t xml:space="preserve">install/loadable/persist</w:t>
+      </w:r>
+      <w:r>
+        <w:t xml:space="preserve"> </w:t>
+      </w:r>
+      <w:r>
+        <w:t xml:space="preserve">need a reachable Open VSX; the capability is proven live (run</w:t>
+      </w:r>
+      <w:r>
+        <w:t xml:space="preserve"> </w:t>
+      </w:r>
+      <w:r>
+        <w:rPr>
+          <w:rStyle w:val="VerbatimChar"/>
+        </w:rPr>
+        <w:t xml:space="preserve">…855046</w:t>
+      </w:r>
+      <w:r>
+        <w:t xml:space="preserve"> </w:t>
+      </w:r>
+      <w:r>
+        <w:t xml:space="preserve">installed 4/5 +</w:t>
+      </w:r>
+      <w:r>
+        <w:t xml:space="preserve"> </w:t>
+      </w:r>
+      <w:r>
+        <w:t xml:space="preserve">the commit's direct 8-ext probe) and the network-independent config round-trip is green,</w:t>
+      </w:r>
+      <w:r>
+        <w:t xml:space="preserve"> </w:t>
+      </w:r>
+      <w:r>
+        <w:t xml:space="preserve">but Open-VSX-unreachable runs install 0 — a bounded, honest</w:t>
+      </w:r>
+      <w:r>
+        <w:t xml:space="preserve"> </w:t>
+      </w:r>
+      <w:r>
+        <w:rPr>
+          <w:b/>
+          <w:bCs/>
+        </w:rPr>
+        <w:t xml:space="preserve">network-SKIP</w:t>
+      </w:r>
+      <w:r>
+        <w:t xml:space="preserve">, not a</w:t>
+      </w:r>
+      <w:r>
+        <w:t xml:space="preserve"> </w:t>
+      </w:r>
+      <w:r>
+        <w:t xml:space="preserve">product FAIL and not a standing full-matrix-green claim.</w:t>
       </w:r>
     </w:p>
     <w:p>

</xml_diff>